<commit_message>
Energy audit lesson, journey map, and an outreach tracker
- new lesson 1.4: mark what gave and took energy across your last month of
  work, which then feeds the dials and the path ranking. Adapted from the
  Jobs to Be Done pushes and pulls work and Cliff Maxwell's energy profile;
  the SLP task list and the mapping onto our paths are ours. Module 1
  renumbered to 1.1 through 1.8 with every cross-reference updated.
- dashboard hero: the six modules as stops on a route, replacing the stage
  road, which stays inside lesson 1.1 where it belongs
- three-sheet tracker (people, applications, weekly) as CSVs with import
  notes for Sheets and Notion, linked from lessons 2.9, 3.8, 4.7 and 5.6
- workbook gains the energy-audit and tracker pages

Co-Authored-By: Claude Fable 5.1 <noreply@anthropic.com>
</commit_message>
<xml_diff>
--- a/public/course/transition-os-workbook.docx
+++ b/public/course/transition-os-workbook.docx
@@ -1444,7 +1444,7 @@
                 <w:sz w:val="21"/>
                 <w:szCs w:val="21"/>
               </w:rPr>
-              <w:t xml:space="preserve">1.4  What you're protecting</w:t>
+              <w:t xml:space="preserve">1.4  What actually gave you energy</w:t>
             </w:r>
           </w:p>
           <w:p>
@@ -1458,7 +1458,7 @@
                 <w:sz w:val="18"/>
                 <w:szCs w:val="18"/>
               </w:rPr>
-              <w:t xml:space="preserve">Four dials, three paths</w:t>
+              <w:t xml:space="preserve">Energisers and drainers</w:t>
             </w:r>
           </w:p>
         </w:tc>
@@ -1529,7 +1529,7 @@
                 <w:sz w:val="21"/>
                 <w:szCs w:val="21"/>
               </w:rPr>
-              <w:t xml:space="preserve">1.5  The part you get to keep</w:t>
+              <w:t xml:space="preserve">1.5  What you're protecting</w:t>
             </w:r>
           </w:p>
           <w:p>
@@ -1543,7 +1543,7 @@
                 <w:sz w:val="18"/>
                 <w:szCs w:val="18"/>
               </w:rPr>
-              <w:t xml:space="preserve">What goes with you</w:t>
+              <w:t xml:space="preserve">Four dials, three paths</w:t>
             </w:r>
           </w:p>
         </w:tc>
@@ -1614,7 +1614,7 @@
                 <w:sz w:val="21"/>
                 <w:szCs w:val="21"/>
               </w:rPr>
-              <w:t xml:space="preserve">1.6  Tell one person</w:t>
+              <w:t xml:space="preserve">1.6  The part you get to keep</w:t>
             </w:r>
           </w:p>
           <w:p>
@@ -1628,7 +1628,7 @@
                 <w:sz w:val="18"/>
                 <w:szCs w:val="18"/>
               </w:rPr>
-              <w:t xml:space="preserve">Who, when, what they said</w:t>
+              <w:t xml:space="preserve">What goes with you</w:t>
             </w:r>
           </w:p>
         </w:tc>
@@ -1699,7 +1699,92 @@
                 <w:sz w:val="21"/>
                 <w:szCs w:val="21"/>
               </w:rPr>
-              <w:t xml:space="preserve">1.7  Checkpoint</w:t>
+              <w:t xml:space="preserve">1.7  Tell one person</w:t>
+            </w:r>
+          </w:p>
+          <w:p>
+            <w:pPr>
+              <w:spacing w:after="0" w:before="0"/>
+            </w:pPr>
+            <w:r>
+              <w:rPr>
+                <w:rFonts w:ascii="Calibri" w:cs="Calibri" w:eastAsia="Calibri" w:hAnsi="Calibri"/>
+                <w:color w:val="6B7280"/>
+                <w:sz w:val="18"/>
+                <w:szCs w:val="18"/>
+              </w:rPr>
+              <w:t xml:space="preserve">Who, when, what they said</w:t>
+            </w:r>
+          </w:p>
+        </w:tc>
+        <w:tc>
+          <w:tcPr>
+            <w:tcW w:type="dxa" w:w="5760"/>
+            <w:tcBorders>
+              <w:top w:val="single" w:color="D1D5DB" w:sz="6"/>
+              <w:left w:val="single" w:color="D1D5DB" w:sz="6"/>
+              <w:bottom w:val="single" w:color="D1D5DB" w:sz="6"/>
+              <w:right w:val="single" w:color="D1D5DB" w:sz="6"/>
+            </w:tcBorders>
+            <w:shd w:fill="FFFFFF" w:color="auto" w:val="clear"/>
+            <w:tcMar>
+              <w:top w:type="dxa" w:w="120"/>
+              <w:left w:type="dxa" w:w="160"/>
+              <w:bottom w:type="dxa" w:w="120"/>
+              <w:right w:type="dxa" w:w="160"/>
+            </w:tcMar>
+          </w:tcPr>
+          <w:p>
+            <w:pPr>
+              <w:spacing w:after="120" w:before="0"/>
+            </w:pPr>
+            <w:r>
+              <w:rPr>
+                <w:rFonts w:ascii="Calibri" w:cs="Calibri" w:eastAsia="Calibri" w:hAnsi="Calibri"/>
+                <w:color w:val="1B1B1E"/>
+                <w:sz w:val="22"/>
+                <w:szCs w:val="22"/>
+              </w:rPr>
+              <w:t xml:space="preserve"> </w:t>
+            </w:r>
+          </w:p>
+        </w:tc>
+      </w:tr>
+      <w:tr>
+        <w:trPr>
+          <w:trHeight w:val="640" w:hRule="atLeast"/>
+        </w:trPr>
+        <w:tc>
+          <w:tcPr>
+            <w:tcW w:type="dxa" w:w="3600"/>
+            <w:tcBorders>
+              <w:top w:val="single" w:color="D1D5DB" w:sz="6"/>
+              <w:left w:val="single" w:color="D1D5DB" w:sz="6"/>
+              <w:bottom w:val="single" w:color="D1D5DB" w:sz="6"/>
+              <w:right w:val="single" w:color="D1D5DB" w:sz="6"/>
+            </w:tcBorders>
+            <w:shd w:fill="F0FAF3" w:color="auto" w:val="clear"/>
+            <w:tcMar>
+              <w:top w:type="dxa" w:w="120"/>
+              <w:left w:type="dxa" w:w="160"/>
+              <w:bottom w:type="dxa" w:w="120"/>
+              <w:right w:type="dxa" w:w="160"/>
+            </w:tcMar>
+          </w:tcPr>
+          <w:p>
+            <w:pPr>
+              <w:spacing w:after="120" w:before="0"/>
+            </w:pPr>
+            <w:r>
+              <w:rPr>
+                <w:rFonts w:ascii="Calibri" w:cs="Calibri" w:eastAsia="Calibri" w:hAnsi="Calibri"/>
+                <w:b/>
+                <w:bCs/>
+                <w:color w:val="1B1B1E"/>
+                <w:sz w:val="21"/>
+                <w:szCs w:val="21"/>
+              </w:rPr>
+              <w:t xml:space="preserve">1.8  Checkpoint</w:t>
             </w:r>
           </w:p>
           <w:p>
@@ -6299,6 +6384,1199 @@
           <w:szCs w:val="17"/>
         </w:rPr>
         <w:t xml:space="preserve">MODULE 1 · LESSON 4 · 8 MIN</w:t>
+      </w:r>
+    </w:p>
+    <w:p>
+      <w:pPr>
+        <w:pStyle w:val="Heading1"/>
+        <w:spacing w:after="60" w:before="0"/>
+      </w:pPr>
+      <w:r>
+        <w:rPr>
+          <w:rFonts w:ascii="Georgia" w:cs="Georgia" w:eastAsia="Georgia" w:hAnsi="Georgia"/>
+          <w:b/>
+          <w:bCs/>
+          <w:color w:val="1B1B1E"/>
+          <w:sz w:val="40"/>
+          <w:szCs w:val="40"/>
+        </w:rPr>
+        <w:t xml:space="preserve">What actually gave you energy</w:t>
+      </w:r>
+    </w:p>
+    <w:p>
+      <w:pPr>
+        <w:spacing w:after="320" w:before="0"/>
+      </w:pPr>
+      <w:r>
+        <w:rPr>
+          <w:rFonts w:ascii="Calibri" w:cs="Calibri" w:eastAsia="Calibri" w:hAnsi="Calibri"/>
+          <w:color w:val="6B7280"/>
+          <w:sz w:val="22"/>
+          <w:szCs w:val="22"/>
+        </w:rPr>
+        <w:t xml:space="preserve">Competence and energy are different things. This page is about the second one.</w:t>
+      </w:r>
+    </w:p>
+    <w:p>
+      <w:pPr>
+        <w:spacing w:after="120" w:before="0"/>
+      </w:pPr>
+      <w:r>
+        <w:rPr>
+          <w:rFonts w:ascii="Calibri" w:cs="Calibri" w:eastAsia="Calibri" w:hAnsi="Calibri"/>
+          <w:color w:val="6B7280"/>
+          <w:sz w:val="20"/>
+          <w:szCs w:val="20"/>
+        </w:rPr>
+        <w:t xml:space="preserve">Work through your last month. For each task, mark whether it gave you energy or took it, and ignore whether you are good at it.</w:t>
+      </w:r>
+    </w:p>
+    <w:tbl>
+      <w:tblPr>
+        <w:tblW w:type="dxa" w:w="9360"/>
+        <w:tblBorders>
+          <w:top w:val="single" w:color="auto" w:sz="4"/>
+          <w:left w:val="single" w:color="auto" w:sz="4"/>
+          <w:bottom w:val="single" w:color="auto" w:sz="4"/>
+          <w:right w:val="single" w:color="auto" w:sz="4"/>
+          <w:insideH w:val="single" w:color="auto" w:sz="4"/>
+          <w:insideV w:val="single" w:color="auto" w:sz="4"/>
+        </w:tblBorders>
+      </w:tblPr>
+      <w:tblGrid>
+        <w:gridCol w:w="3600"/>
+        <w:gridCol w:w="5760"/>
+      </w:tblGrid>
+      <w:tr>
+        <w:trPr>
+          <w:trHeight w:val="640" w:hRule="atLeast"/>
+        </w:trPr>
+        <w:tc>
+          <w:tcPr>
+            <w:tcW w:type="dxa" w:w="3600"/>
+            <w:tcBorders>
+              <w:top w:val="single" w:color="D1D5DB" w:sz="6"/>
+              <w:left w:val="single" w:color="D1D5DB" w:sz="6"/>
+              <w:bottom w:val="single" w:color="D1D5DB" w:sz="6"/>
+              <w:right w:val="single" w:color="D1D5DB" w:sz="6"/>
+            </w:tcBorders>
+            <w:shd w:fill="F0FAF3" w:color="auto" w:val="clear"/>
+            <w:tcMar>
+              <w:top w:type="dxa" w:w="120"/>
+              <w:left w:type="dxa" w:w="160"/>
+              <w:bottom w:type="dxa" w:w="120"/>
+              <w:right w:type="dxa" w:w="160"/>
+            </w:tcMar>
+          </w:tcPr>
+          <w:p>
+            <w:pPr>
+              <w:spacing w:after="120" w:before="0"/>
+            </w:pPr>
+            <w:r>
+              <w:rPr>
+                <w:rFonts w:ascii="Calibri" w:cs="Calibri" w:eastAsia="Calibri" w:hAnsi="Calibri"/>
+                <w:b/>
+                <w:bCs/>
+                <w:color w:val="1B1B1E"/>
+                <w:sz w:val="21"/>
+                <w:szCs w:val="21"/>
+              </w:rPr>
+              <w:t xml:space="preserve">Direct therapy sessions</w:t>
+            </w:r>
+          </w:p>
+          <w:p>
+            <w:pPr>
+              <w:spacing w:after="0" w:before="0"/>
+            </w:pPr>
+            <w:r>
+              <w:rPr>
+                <w:rFonts w:ascii="Calibri" w:cs="Calibri" w:eastAsia="Calibri" w:hAnsi="Calibri"/>
+                <w:color w:val="6B7280"/>
+                <w:sz w:val="18"/>
+                <w:szCs w:val="18"/>
+              </w:rPr>
+              <w:t xml:space="preserve">Gave  /  Took</w:t>
+            </w:r>
+          </w:p>
+        </w:tc>
+        <w:tc>
+          <w:tcPr>
+            <w:tcW w:type="dxa" w:w="5760"/>
+            <w:tcBorders>
+              <w:top w:val="single" w:color="D1D5DB" w:sz="6"/>
+              <w:left w:val="single" w:color="D1D5DB" w:sz="6"/>
+              <w:bottom w:val="single" w:color="D1D5DB" w:sz="6"/>
+              <w:right w:val="single" w:color="D1D5DB" w:sz="6"/>
+            </w:tcBorders>
+            <w:shd w:fill="FFFFFF" w:color="auto" w:val="clear"/>
+            <w:tcMar>
+              <w:top w:type="dxa" w:w="120"/>
+              <w:left w:type="dxa" w:w="160"/>
+              <w:bottom w:type="dxa" w:w="120"/>
+              <w:right w:type="dxa" w:w="160"/>
+            </w:tcMar>
+          </w:tcPr>
+          <w:p>
+            <w:pPr>
+              <w:spacing w:after="120" w:before="0"/>
+            </w:pPr>
+            <w:r>
+              <w:rPr>
+                <w:rFonts w:ascii="Calibri" w:cs="Calibri" w:eastAsia="Calibri" w:hAnsi="Calibri"/>
+                <w:color w:val="1B1B1E"/>
+                <w:sz w:val="22"/>
+                <w:szCs w:val="22"/>
+              </w:rPr>
+              <w:t xml:space="preserve"> </w:t>
+            </w:r>
+          </w:p>
+        </w:tc>
+      </w:tr>
+      <w:tr>
+        <w:trPr>
+          <w:trHeight w:val="640" w:hRule="atLeast"/>
+        </w:trPr>
+        <w:tc>
+          <w:tcPr>
+            <w:tcW w:type="dxa" w:w="3600"/>
+            <w:tcBorders>
+              <w:top w:val="single" w:color="D1D5DB" w:sz="6"/>
+              <w:left w:val="single" w:color="D1D5DB" w:sz="6"/>
+              <w:bottom w:val="single" w:color="D1D5DB" w:sz="6"/>
+              <w:right w:val="single" w:color="D1D5DB" w:sz="6"/>
+            </w:tcBorders>
+            <w:shd w:fill="F0FAF3" w:color="auto" w:val="clear"/>
+            <w:tcMar>
+              <w:top w:type="dxa" w:w="120"/>
+              <w:left w:type="dxa" w:w="160"/>
+              <w:bottom w:type="dxa" w:w="120"/>
+              <w:right w:type="dxa" w:w="160"/>
+            </w:tcMar>
+          </w:tcPr>
+          <w:p>
+            <w:pPr>
+              <w:spacing w:after="120" w:before="0"/>
+            </w:pPr>
+            <w:r>
+              <w:rPr>
+                <w:rFonts w:ascii="Calibri" w:cs="Calibri" w:eastAsia="Calibri" w:hAnsi="Calibri"/>
+                <w:b/>
+                <w:bCs/>
+                <w:color w:val="1B1B1E"/>
+                <w:sz w:val="21"/>
+                <w:szCs w:val="21"/>
+              </w:rPr>
+              <w:t xml:space="preserve">Evaluations and report writing</w:t>
+            </w:r>
+          </w:p>
+          <w:p>
+            <w:pPr>
+              <w:spacing w:after="0" w:before="0"/>
+            </w:pPr>
+            <w:r>
+              <w:rPr>
+                <w:rFonts w:ascii="Calibri" w:cs="Calibri" w:eastAsia="Calibri" w:hAnsi="Calibri"/>
+                <w:color w:val="6B7280"/>
+                <w:sz w:val="18"/>
+                <w:szCs w:val="18"/>
+              </w:rPr>
+              <w:t xml:space="preserve">Gave  /  Took</w:t>
+            </w:r>
+          </w:p>
+        </w:tc>
+        <w:tc>
+          <w:tcPr>
+            <w:tcW w:type="dxa" w:w="5760"/>
+            <w:tcBorders>
+              <w:top w:val="single" w:color="D1D5DB" w:sz="6"/>
+              <w:left w:val="single" w:color="D1D5DB" w:sz="6"/>
+              <w:bottom w:val="single" w:color="D1D5DB" w:sz="6"/>
+              <w:right w:val="single" w:color="D1D5DB" w:sz="6"/>
+            </w:tcBorders>
+            <w:shd w:fill="FFFFFF" w:color="auto" w:val="clear"/>
+            <w:tcMar>
+              <w:top w:type="dxa" w:w="120"/>
+              <w:left w:type="dxa" w:w="160"/>
+              <w:bottom w:type="dxa" w:w="120"/>
+              <w:right w:type="dxa" w:w="160"/>
+            </w:tcMar>
+          </w:tcPr>
+          <w:p>
+            <w:pPr>
+              <w:spacing w:after="120" w:before="0"/>
+            </w:pPr>
+            <w:r>
+              <w:rPr>
+                <w:rFonts w:ascii="Calibri" w:cs="Calibri" w:eastAsia="Calibri" w:hAnsi="Calibri"/>
+                <w:color w:val="1B1B1E"/>
+                <w:sz w:val="22"/>
+                <w:szCs w:val="22"/>
+              </w:rPr>
+              <w:t xml:space="preserve"> </w:t>
+            </w:r>
+          </w:p>
+        </w:tc>
+      </w:tr>
+      <w:tr>
+        <w:trPr>
+          <w:trHeight w:val="640" w:hRule="atLeast"/>
+        </w:trPr>
+        <w:tc>
+          <w:tcPr>
+            <w:tcW w:type="dxa" w:w="3600"/>
+            <w:tcBorders>
+              <w:top w:val="single" w:color="D1D5DB" w:sz="6"/>
+              <w:left w:val="single" w:color="D1D5DB" w:sz="6"/>
+              <w:bottom w:val="single" w:color="D1D5DB" w:sz="6"/>
+              <w:right w:val="single" w:color="D1D5DB" w:sz="6"/>
+            </w:tcBorders>
+            <w:shd w:fill="F0FAF3" w:color="auto" w:val="clear"/>
+            <w:tcMar>
+              <w:top w:type="dxa" w:w="120"/>
+              <w:left w:type="dxa" w:w="160"/>
+              <w:bottom w:type="dxa" w:w="120"/>
+              <w:right w:type="dxa" w:w="160"/>
+            </w:tcMar>
+          </w:tcPr>
+          <w:p>
+            <w:pPr>
+              <w:spacing w:after="120" w:before="0"/>
+            </w:pPr>
+            <w:r>
+              <w:rPr>
+                <w:rFonts w:ascii="Calibri" w:cs="Calibri" w:eastAsia="Calibri" w:hAnsi="Calibri"/>
+                <w:b/>
+                <w:bCs/>
+                <w:color w:val="1B1B1E"/>
+                <w:sz w:val="21"/>
+                <w:szCs w:val="21"/>
+              </w:rPr>
+              <w:t xml:space="preserve">IEP or care-plan meetings</w:t>
+            </w:r>
+          </w:p>
+          <w:p>
+            <w:pPr>
+              <w:spacing w:after="0" w:before="0"/>
+            </w:pPr>
+            <w:r>
+              <w:rPr>
+                <w:rFonts w:ascii="Calibri" w:cs="Calibri" w:eastAsia="Calibri" w:hAnsi="Calibri"/>
+                <w:color w:val="6B7280"/>
+                <w:sz w:val="18"/>
+                <w:szCs w:val="18"/>
+              </w:rPr>
+              <w:t xml:space="preserve">Gave  /  Took</w:t>
+            </w:r>
+          </w:p>
+        </w:tc>
+        <w:tc>
+          <w:tcPr>
+            <w:tcW w:type="dxa" w:w="5760"/>
+            <w:tcBorders>
+              <w:top w:val="single" w:color="D1D5DB" w:sz="6"/>
+              <w:left w:val="single" w:color="D1D5DB" w:sz="6"/>
+              <w:bottom w:val="single" w:color="D1D5DB" w:sz="6"/>
+              <w:right w:val="single" w:color="D1D5DB" w:sz="6"/>
+            </w:tcBorders>
+            <w:shd w:fill="FFFFFF" w:color="auto" w:val="clear"/>
+            <w:tcMar>
+              <w:top w:type="dxa" w:w="120"/>
+              <w:left w:type="dxa" w:w="160"/>
+              <w:bottom w:type="dxa" w:w="120"/>
+              <w:right w:type="dxa" w:w="160"/>
+            </w:tcMar>
+          </w:tcPr>
+          <w:p>
+            <w:pPr>
+              <w:spacing w:after="120" w:before="0"/>
+            </w:pPr>
+            <w:r>
+              <w:rPr>
+                <w:rFonts w:ascii="Calibri" w:cs="Calibri" w:eastAsia="Calibri" w:hAnsi="Calibri"/>
+                <w:color w:val="1B1B1E"/>
+                <w:sz w:val="22"/>
+                <w:szCs w:val="22"/>
+              </w:rPr>
+              <w:t xml:space="preserve"> </w:t>
+            </w:r>
+          </w:p>
+        </w:tc>
+      </w:tr>
+      <w:tr>
+        <w:trPr>
+          <w:trHeight w:val="640" w:hRule="atLeast"/>
+        </w:trPr>
+        <w:tc>
+          <w:tcPr>
+            <w:tcW w:type="dxa" w:w="3600"/>
+            <w:tcBorders>
+              <w:top w:val="single" w:color="D1D5DB" w:sz="6"/>
+              <w:left w:val="single" w:color="D1D5DB" w:sz="6"/>
+              <w:bottom w:val="single" w:color="D1D5DB" w:sz="6"/>
+              <w:right w:val="single" w:color="D1D5DB" w:sz="6"/>
+            </w:tcBorders>
+            <w:shd w:fill="F0FAF3" w:color="auto" w:val="clear"/>
+            <w:tcMar>
+              <w:top w:type="dxa" w:w="120"/>
+              <w:left w:type="dxa" w:w="160"/>
+              <w:bottom w:type="dxa" w:w="120"/>
+              <w:right w:type="dxa" w:w="160"/>
+            </w:tcMar>
+          </w:tcPr>
+          <w:p>
+            <w:pPr>
+              <w:spacing w:after="120" w:before="0"/>
+            </w:pPr>
+            <w:r>
+              <w:rPr>
+                <w:rFonts w:ascii="Calibri" w:cs="Calibri" w:eastAsia="Calibri" w:hAnsi="Calibri"/>
+                <w:b/>
+                <w:bCs/>
+                <w:color w:val="1B1B1E"/>
+                <w:sz w:val="21"/>
+                <w:szCs w:val="21"/>
+              </w:rPr>
+              <w:t xml:space="preserve">Progress notes and documentation</w:t>
+            </w:r>
+          </w:p>
+          <w:p>
+            <w:pPr>
+              <w:spacing w:after="0" w:before="0"/>
+            </w:pPr>
+            <w:r>
+              <w:rPr>
+                <w:rFonts w:ascii="Calibri" w:cs="Calibri" w:eastAsia="Calibri" w:hAnsi="Calibri"/>
+                <w:color w:val="6B7280"/>
+                <w:sz w:val="18"/>
+                <w:szCs w:val="18"/>
+              </w:rPr>
+              <w:t xml:space="preserve">Gave  /  Took</w:t>
+            </w:r>
+          </w:p>
+        </w:tc>
+        <w:tc>
+          <w:tcPr>
+            <w:tcW w:type="dxa" w:w="5760"/>
+            <w:tcBorders>
+              <w:top w:val="single" w:color="D1D5DB" w:sz="6"/>
+              <w:left w:val="single" w:color="D1D5DB" w:sz="6"/>
+              <w:bottom w:val="single" w:color="D1D5DB" w:sz="6"/>
+              <w:right w:val="single" w:color="D1D5DB" w:sz="6"/>
+            </w:tcBorders>
+            <w:shd w:fill="FFFFFF" w:color="auto" w:val="clear"/>
+            <w:tcMar>
+              <w:top w:type="dxa" w:w="120"/>
+              <w:left w:type="dxa" w:w="160"/>
+              <w:bottom w:type="dxa" w:w="120"/>
+              <w:right w:type="dxa" w:w="160"/>
+            </w:tcMar>
+          </w:tcPr>
+          <w:p>
+            <w:pPr>
+              <w:spacing w:after="120" w:before="0"/>
+            </w:pPr>
+            <w:r>
+              <w:rPr>
+                <w:rFonts w:ascii="Calibri" w:cs="Calibri" w:eastAsia="Calibri" w:hAnsi="Calibri"/>
+                <w:color w:val="1B1B1E"/>
+                <w:sz w:val="22"/>
+                <w:szCs w:val="22"/>
+              </w:rPr>
+              <w:t xml:space="preserve"> </w:t>
+            </w:r>
+          </w:p>
+        </w:tc>
+      </w:tr>
+      <w:tr>
+        <w:trPr>
+          <w:trHeight w:val="640" w:hRule="atLeast"/>
+        </w:trPr>
+        <w:tc>
+          <w:tcPr>
+            <w:tcW w:type="dxa" w:w="3600"/>
+            <w:tcBorders>
+              <w:top w:val="single" w:color="D1D5DB" w:sz="6"/>
+              <w:left w:val="single" w:color="D1D5DB" w:sz="6"/>
+              <w:bottom w:val="single" w:color="D1D5DB" w:sz="6"/>
+              <w:right w:val="single" w:color="D1D5DB" w:sz="6"/>
+            </w:tcBorders>
+            <w:shd w:fill="F0FAF3" w:color="auto" w:val="clear"/>
+            <w:tcMar>
+              <w:top w:type="dxa" w:w="120"/>
+              <w:left w:type="dxa" w:w="160"/>
+              <w:bottom w:type="dxa" w:w="120"/>
+              <w:right w:type="dxa" w:w="160"/>
+            </w:tcMar>
+          </w:tcPr>
+          <w:p>
+            <w:pPr>
+              <w:spacing w:after="120" w:before="0"/>
+            </w:pPr>
+            <w:r>
+              <w:rPr>
+                <w:rFonts w:ascii="Calibri" w:cs="Calibri" w:eastAsia="Calibri" w:hAnsi="Calibri"/>
+                <w:b/>
+                <w:bCs/>
+                <w:color w:val="1B1B1E"/>
+                <w:sz w:val="21"/>
+                <w:szCs w:val="21"/>
+              </w:rPr>
+              <w:t xml:space="preserve">Parent and family conversations</w:t>
+            </w:r>
+          </w:p>
+          <w:p>
+            <w:pPr>
+              <w:spacing w:after="0" w:before="0"/>
+            </w:pPr>
+            <w:r>
+              <w:rPr>
+                <w:rFonts w:ascii="Calibri" w:cs="Calibri" w:eastAsia="Calibri" w:hAnsi="Calibri"/>
+                <w:color w:val="6B7280"/>
+                <w:sz w:val="18"/>
+                <w:szCs w:val="18"/>
+              </w:rPr>
+              <w:t xml:space="preserve">Gave  /  Took</w:t>
+            </w:r>
+          </w:p>
+        </w:tc>
+        <w:tc>
+          <w:tcPr>
+            <w:tcW w:type="dxa" w:w="5760"/>
+            <w:tcBorders>
+              <w:top w:val="single" w:color="D1D5DB" w:sz="6"/>
+              <w:left w:val="single" w:color="D1D5DB" w:sz="6"/>
+              <w:bottom w:val="single" w:color="D1D5DB" w:sz="6"/>
+              <w:right w:val="single" w:color="D1D5DB" w:sz="6"/>
+            </w:tcBorders>
+            <w:shd w:fill="FFFFFF" w:color="auto" w:val="clear"/>
+            <w:tcMar>
+              <w:top w:type="dxa" w:w="120"/>
+              <w:left w:type="dxa" w:w="160"/>
+              <w:bottom w:type="dxa" w:w="120"/>
+              <w:right w:type="dxa" w:w="160"/>
+            </w:tcMar>
+          </w:tcPr>
+          <w:p>
+            <w:pPr>
+              <w:spacing w:after="120" w:before="0"/>
+            </w:pPr>
+            <w:r>
+              <w:rPr>
+                <w:rFonts w:ascii="Calibri" w:cs="Calibri" w:eastAsia="Calibri" w:hAnsi="Calibri"/>
+                <w:color w:val="1B1B1E"/>
+                <w:sz w:val="22"/>
+                <w:szCs w:val="22"/>
+              </w:rPr>
+              <w:t xml:space="preserve"> </w:t>
+            </w:r>
+          </w:p>
+        </w:tc>
+      </w:tr>
+      <w:tr>
+        <w:trPr>
+          <w:trHeight w:val="640" w:hRule="atLeast"/>
+        </w:trPr>
+        <w:tc>
+          <w:tcPr>
+            <w:tcW w:type="dxa" w:w="3600"/>
+            <w:tcBorders>
+              <w:top w:val="single" w:color="D1D5DB" w:sz="6"/>
+              <w:left w:val="single" w:color="D1D5DB" w:sz="6"/>
+              <w:bottom w:val="single" w:color="D1D5DB" w:sz="6"/>
+              <w:right w:val="single" w:color="D1D5DB" w:sz="6"/>
+            </w:tcBorders>
+            <w:shd w:fill="F0FAF3" w:color="auto" w:val="clear"/>
+            <w:tcMar>
+              <w:top w:type="dxa" w:w="120"/>
+              <w:left w:type="dxa" w:w="160"/>
+              <w:bottom w:type="dxa" w:w="120"/>
+              <w:right w:type="dxa" w:w="160"/>
+            </w:tcMar>
+          </w:tcPr>
+          <w:p>
+            <w:pPr>
+              <w:spacing w:after="120" w:before="0"/>
+            </w:pPr>
+            <w:r>
+              <w:rPr>
+                <w:rFonts w:ascii="Calibri" w:cs="Calibri" w:eastAsia="Calibri" w:hAnsi="Calibri"/>
+                <w:b/>
+                <w:bCs/>
+                <w:color w:val="1B1B1E"/>
+                <w:sz w:val="21"/>
+                <w:szCs w:val="21"/>
+              </w:rPr>
+              <w:t xml:space="preserve">Supervising CFs or students</w:t>
+            </w:r>
+          </w:p>
+          <w:p>
+            <w:pPr>
+              <w:spacing w:after="0" w:before="0"/>
+            </w:pPr>
+            <w:r>
+              <w:rPr>
+                <w:rFonts w:ascii="Calibri" w:cs="Calibri" w:eastAsia="Calibri" w:hAnsi="Calibri"/>
+                <w:color w:val="6B7280"/>
+                <w:sz w:val="18"/>
+                <w:szCs w:val="18"/>
+              </w:rPr>
+              <w:t xml:space="preserve">Gave  /  Took</w:t>
+            </w:r>
+          </w:p>
+        </w:tc>
+        <w:tc>
+          <w:tcPr>
+            <w:tcW w:type="dxa" w:w="5760"/>
+            <w:tcBorders>
+              <w:top w:val="single" w:color="D1D5DB" w:sz="6"/>
+              <w:left w:val="single" w:color="D1D5DB" w:sz="6"/>
+              <w:bottom w:val="single" w:color="D1D5DB" w:sz="6"/>
+              <w:right w:val="single" w:color="D1D5DB" w:sz="6"/>
+            </w:tcBorders>
+            <w:shd w:fill="FFFFFF" w:color="auto" w:val="clear"/>
+            <w:tcMar>
+              <w:top w:type="dxa" w:w="120"/>
+              <w:left w:type="dxa" w:w="160"/>
+              <w:bottom w:type="dxa" w:w="120"/>
+              <w:right w:type="dxa" w:w="160"/>
+            </w:tcMar>
+          </w:tcPr>
+          <w:p>
+            <w:pPr>
+              <w:spacing w:after="120" w:before="0"/>
+            </w:pPr>
+            <w:r>
+              <w:rPr>
+                <w:rFonts w:ascii="Calibri" w:cs="Calibri" w:eastAsia="Calibri" w:hAnsi="Calibri"/>
+                <w:color w:val="1B1B1E"/>
+                <w:sz w:val="22"/>
+                <w:szCs w:val="22"/>
+              </w:rPr>
+              <w:t xml:space="preserve"> </w:t>
+            </w:r>
+          </w:p>
+        </w:tc>
+      </w:tr>
+      <w:tr>
+        <w:trPr>
+          <w:trHeight w:val="640" w:hRule="atLeast"/>
+        </w:trPr>
+        <w:tc>
+          <w:tcPr>
+            <w:tcW w:type="dxa" w:w="3600"/>
+            <w:tcBorders>
+              <w:top w:val="single" w:color="D1D5DB" w:sz="6"/>
+              <w:left w:val="single" w:color="D1D5DB" w:sz="6"/>
+              <w:bottom w:val="single" w:color="D1D5DB" w:sz="6"/>
+              <w:right w:val="single" w:color="D1D5DB" w:sz="6"/>
+            </w:tcBorders>
+            <w:shd w:fill="F0FAF3" w:color="auto" w:val="clear"/>
+            <w:tcMar>
+              <w:top w:type="dxa" w:w="120"/>
+              <w:left w:type="dxa" w:w="160"/>
+              <w:bottom w:type="dxa" w:w="120"/>
+              <w:right w:type="dxa" w:w="160"/>
+            </w:tcMar>
+          </w:tcPr>
+          <w:p>
+            <w:pPr>
+              <w:spacing w:after="120" w:before="0"/>
+            </w:pPr>
+            <w:r>
+              <w:rPr>
+                <w:rFonts w:ascii="Calibri" w:cs="Calibri" w:eastAsia="Calibri" w:hAnsi="Calibri"/>
+                <w:b/>
+                <w:bCs/>
+                <w:color w:val="1B1B1E"/>
+                <w:sz w:val="21"/>
+                <w:szCs w:val="21"/>
+              </w:rPr>
+              <w:t xml:space="preserve">Training colleagues or staff</w:t>
+            </w:r>
+          </w:p>
+          <w:p>
+            <w:pPr>
+              <w:spacing w:after="0" w:before="0"/>
+            </w:pPr>
+            <w:r>
+              <w:rPr>
+                <w:rFonts w:ascii="Calibri" w:cs="Calibri" w:eastAsia="Calibri" w:hAnsi="Calibri"/>
+                <w:color w:val="6B7280"/>
+                <w:sz w:val="18"/>
+                <w:szCs w:val="18"/>
+              </w:rPr>
+              <w:t xml:space="preserve">Gave  /  Took</w:t>
+            </w:r>
+          </w:p>
+        </w:tc>
+        <w:tc>
+          <w:tcPr>
+            <w:tcW w:type="dxa" w:w="5760"/>
+            <w:tcBorders>
+              <w:top w:val="single" w:color="D1D5DB" w:sz="6"/>
+              <w:left w:val="single" w:color="D1D5DB" w:sz="6"/>
+              <w:bottom w:val="single" w:color="D1D5DB" w:sz="6"/>
+              <w:right w:val="single" w:color="D1D5DB" w:sz="6"/>
+            </w:tcBorders>
+            <w:shd w:fill="FFFFFF" w:color="auto" w:val="clear"/>
+            <w:tcMar>
+              <w:top w:type="dxa" w:w="120"/>
+              <w:left w:type="dxa" w:w="160"/>
+              <w:bottom w:type="dxa" w:w="120"/>
+              <w:right w:type="dxa" w:w="160"/>
+            </w:tcMar>
+          </w:tcPr>
+          <w:p>
+            <w:pPr>
+              <w:spacing w:after="120" w:before="0"/>
+            </w:pPr>
+            <w:r>
+              <w:rPr>
+                <w:rFonts w:ascii="Calibri" w:cs="Calibri" w:eastAsia="Calibri" w:hAnsi="Calibri"/>
+                <w:color w:val="1B1B1E"/>
+                <w:sz w:val="22"/>
+                <w:szCs w:val="22"/>
+              </w:rPr>
+              <w:t xml:space="preserve"> </w:t>
+            </w:r>
+          </w:p>
+        </w:tc>
+      </w:tr>
+      <w:tr>
+        <w:trPr>
+          <w:trHeight w:val="640" w:hRule="atLeast"/>
+        </w:trPr>
+        <w:tc>
+          <w:tcPr>
+            <w:tcW w:type="dxa" w:w="3600"/>
+            <w:tcBorders>
+              <w:top w:val="single" w:color="D1D5DB" w:sz="6"/>
+              <w:left w:val="single" w:color="D1D5DB" w:sz="6"/>
+              <w:bottom w:val="single" w:color="D1D5DB" w:sz="6"/>
+              <w:right w:val="single" w:color="D1D5DB" w:sz="6"/>
+            </w:tcBorders>
+            <w:shd w:fill="F0FAF3" w:color="auto" w:val="clear"/>
+            <w:tcMar>
+              <w:top w:type="dxa" w:w="120"/>
+              <w:left w:type="dxa" w:w="160"/>
+              <w:bottom w:type="dxa" w:w="120"/>
+              <w:right w:type="dxa" w:w="160"/>
+            </w:tcMar>
+          </w:tcPr>
+          <w:p>
+            <w:pPr>
+              <w:spacing w:after="120" w:before="0"/>
+            </w:pPr>
+            <w:r>
+              <w:rPr>
+                <w:rFonts w:ascii="Calibri" w:cs="Calibri" w:eastAsia="Calibri" w:hAnsi="Calibri"/>
+                <w:b/>
+                <w:bCs/>
+                <w:color w:val="1B1B1E"/>
+                <w:sz w:val="21"/>
+                <w:szCs w:val="21"/>
+              </w:rPr>
+              <w:t xml:space="preserve">Data collection and progress monitoring</w:t>
+            </w:r>
+          </w:p>
+          <w:p>
+            <w:pPr>
+              <w:spacing w:after="0" w:before="0"/>
+            </w:pPr>
+            <w:r>
+              <w:rPr>
+                <w:rFonts w:ascii="Calibri" w:cs="Calibri" w:eastAsia="Calibri" w:hAnsi="Calibri"/>
+                <w:color w:val="6B7280"/>
+                <w:sz w:val="18"/>
+                <w:szCs w:val="18"/>
+              </w:rPr>
+              <w:t xml:space="preserve">Gave  /  Took</w:t>
+            </w:r>
+          </w:p>
+        </w:tc>
+        <w:tc>
+          <w:tcPr>
+            <w:tcW w:type="dxa" w:w="5760"/>
+            <w:tcBorders>
+              <w:top w:val="single" w:color="D1D5DB" w:sz="6"/>
+              <w:left w:val="single" w:color="D1D5DB" w:sz="6"/>
+              <w:bottom w:val="single" w:color="D1D5DB" w:sz="6"/>
+              <w:right w:val="single" w:color="D1D5DB" w:sz="6"/>
+            </w:tcBorders>
+            <w:shd w:fill="FFFFFF" w:color="auto" w:val="clear"/>
+            <w:tcMar>
+              <w:top w:type="dxa" w:w="120"/>
+              <w:left w:type="dxa" w:w="160"/>
+              <w:bottom w:type="dxa" w:w="120"/>
+              <w:right w:type="dxa" w:w="160"/>
+            </w:tcMar>
+          </w:tcPr>
+          <w:p>
+            <w:pPr>
+              <w:spacing w:after="120" w:before="0"/>
+            </w:pPr>
+            <w:r>
+              <w:rPr>
+                <w:rFonts w:ascii="Calibri" w:cs="Calibri" w:eastAsia="Calibri" w:hAnsi="Calibri"/>
+                <w:color w:val="1B1B1E"/>
+                <w:sz w:val="22"/>
+                <w:szCs w:val="22"/>
+              </w:rPr>
+              <w:t xml:space="preserve"> </w:t>
+            </w:r>
+          </w:p>
+        </w:tc>
+      </w:tr>
+      <w:tr>
+        <w:trPr>
+          <w:trHeight w:val="640" w:hRule="atLeast"/>
+        </w:trPr>
+        <w:tc>
+          <w:tcPr>
+            <w:tcW w:type="dxa" w:w="3600"/>
+            <w:tcBorders>
+              <w:top w:val="single" w:color="D1D5DB" w:sz="6"/>
+              <w:left w:val="single" w:color="D1D5DB" w:sz="6"/>
+              <w:bottom w:val="single" w:color="D1D5DB" w:sz="6"/>
+              <w:right w:val="single" w:color="D1D5DB" w:sz="6"/>
+            </w:tcBorders>
+            <w:shd w:fill="F0FAF3" w:color="auto" w:val="clear"/>
+            <w:tcMar>
+              <w:top w:type="dxa" w:w="120"/>
+              <w:left w:type="dxa" w:w="160"/>
+              <w:bottom w:type="dxa" w:w="120"/>
+              <w:right w:type="dxa" w:w="160"/>
+            </w:tcMar>
+          </w:tcPr>
+          <w:p>
+            <w:pPr>
+              <w:spacing w:after="120" w:before="0"/>
+            </w:pPr>
+            <w:r>
+              <w:rPr>
+                <w:rFonts w:ascii="Calibri" w:cs="Calibri" w:eastAsia="Calibri" w:hAnsi="Calibri"/>
+                <w:b/>
+                <w:bCs/>
+                <w:color w:val="1B1B1E"/>
+                <w:sz w:val="21"/>
+                <w:szCs w:val="21"/>
+              </w:rPr>
+              <w:t xml:space="preserve">Choosing or trialling AAC and devices</w:t>
+            </w:r>
+          </w:p>
+          <w:p>
+            <w:pPr>
+              <w:spacing w:after="0" w:before="0"/>
+            </w:pPr>
+            <w:r>
+              <w:rPr>
+                <w:rFonts w:ascii="Calibri" w:cs="Calibri" w:eastAsia="Calibri" w:hAnsi="Calibri"/>
+                <w:color w:val="6B7280"/>
+                <w:sz w:val="18"/>
+                <w:szCs w:val="18"/>
+              </w:rPr>
+              <w:t xml:space="preserve">Gave  /  Took</w:t>
+            </w:r>
+          </w:p>
+        </w:tc>
+        <w:tc>
+          <w:tcPr>
+            <w:tcW w:type="dxa" w:w="5760"/>
+            <w:tcBorders>
+              <w:top w:val="single" w:color="D1D5DB" w:sz="6"/>
+              <w:left w:val="single" w:color="D1D5DB" w:sz="6"/>
+              <w:bottom w:val="single" w:color="D1D5DB" w:sz="6"/>
+              <w:right w:val="single" w:color="D1D5DB" w:sz="6"/>
+            </w:tcBorders>
+            <w:shd w:fill="FFFFFF" w:color="auto" w:val="clear"/>
+            <w:tcMar>
+              <w:top w:type="dxa" w:w="120"/>
+              <w:left w:type="dxa" w:w="160"/>
+              <w:bottom w:type="dxa" w:w="120"/>
+              <w:right w:type="dxa" w:w="160"/>
+            </w:tcMar>
+          </w:tcPr>
+          <w:p>
+            <w:pPr>
+              <w:spacing w:after="120" w:before="0"/>
+            </w:pPr>
+            <w:r>
+              <w:rPr>
+                <w:rFonts w:ascii="Calibri" w:cs="Calibri" w:eastAsia="Calibri" w:hAnsi="Calibri"/>
+                <w:color w:val="1B1B1E"/>
+                <w:sz w:val="22"/>
+                <w:szCs w:val="22"/>
+              </w:rPr>
+              <w:t xml:space="preserve"> </w:t>
+            </w:r>
+          </w:p>
+        </w:tc>
+      </w:tr>
+      <w:tr>
+        <w:trPr>
+          <w:trHeight w:val="640" w:hRule="atLeast"/>
+        </w:trPr>
+        <w:tc>
+          <w:tcPr>
+            <w:tcW w:type="dxa" w:w="3600"/>
+            <w:tcBorders>
+              <w:top w:val="single" w:color="D1D5DB" w:sz="6"/>
+              <w:left w:val="single" w:color="D1D5DB" w:sz="6"/>
+              <w:bottom w:val="single" w:color="D1D5DB" w:sz="6"/>
+              <w:right w:val="single" w:color="D1D5DB" w:sz="6"/>
+            </w:tcBorders>
+            <w:shd w:fill="F0FAF3" w:color="auto" w:val="clear"/>
+            <w:tcMar>
+              <w:top w:type="dxa" w:w="120"/>
+              <w:left w:type="dxa" w:w="160"/>
+              <w:bottom w:type="dxa" w:w="120"/>
+              <w:right w:type="dxa" w:w="160"/>
+            </w:tcMar>
+          </w:tcPr>
+          <w:p>
+            <w:pPr>
+              <w:spacing w:after="120" w:before="0"/>
+            </w:pPr>
+            <w:r>
+              <w:rPr>
+                <w:rFonts w:ascii="Calibri" w:cs="Calibri" w:eastAsia="Calibri" w:hAnsi="Calibri"/>
+                <w:b/>
+                <w:bCs/>
+                <w:color w:val="1B1B1E"/>
+                <w:sz w:val="21"/>
+                <w:szCs w:val="21"/>
+              </w:rPr>
+              <w:t xml:space="preserve">Learning a new system or platform</w:t>
+            </w:r>
+          </w:p>
+          <w:p>
+            <w:pPr>
+              <w:spacing w:after="0" w:before="0"/>
+            </w:pPr>
+            <w:r>
+              <w:rPr>
+                <w:rFonts w:ascii="Calibri" w:cs="Calibri" w:eastAsia="Calibri" w:hAnsi="Calibri"/>
+                <w:color w:val="6B7280"/>
+                <w:sz w:val="18"/>
+                <w:szCs w:val="18"/>
+              </w:rPr>
+              <w:t xml:space="preserve">Gave  /  Took</w:t>
+            </w:r>
+          </w:p>
+        </w:tc>
+        <w:tc>
+          <w:tcPr>
+            <w:tcW w:type="dxa" w:w="5760"/>
+            <w:tcBorders>
+              <w:top w:val="single" w:color="D1D5DB" w:sz="6"/>
+              <w:left w:val="single" w:color="D1D5DB" w:sz="6"/>
+              <w:bottom w:val="single" w:color="D1D5DB" w:sz="6"/>
+              <w:right w:val="single" w:color="D1D5DB" w:sz="6"/>
+            </w:tcBorders>
+            <w:shd w:fill="FFFFFF" w:color="auto" w:val="clear"/>
+            <w:tcMar>
+              <w:top w:type="dxa" w:w="120"/>
+              <w:left w:type="dxa" w:w="160"/>
+              <w:bottom w:type="dxa" w:w="120"/>
+              <w:right w:type="dxa" w:w="160"/>
+            </w:tcMar>
+          </w:tcPr>
+          <w:p>
+            <w:pPr>
+              <w:spacing w:after="120" w:before="0"/>
+            </w:pPr>
+            <w:r>
+              <w:rPr>
+                <w:rFonts w:ascii="Calibri" w:cs="Calibri" w:eastAsia="Calibri" w:hAnsi="Calibri"/>
+                <w:color w:val="1B1B1E"/>
+                <w:sz w:val="22"/>
+                <w:szCs w:val="22"/>
+              </w:rPr>
+              <w:t xml:space="preserve"> </w:t>
+            </w:r>
+          </w:p>
+        </w:tc>
+      </w:tr>
+    </w:tbl>
+    <w:p>
+      <w:pPr>
+        <w:spacing w:after="200" w:before="0" w:line="120"/>
+      </w:pPr>
+      <w:r>
+        <w:rPr>
+          <w:rFonts w:ascii="Calibri" w:cs="Calibri" w:eastAsia="Calibri" w:hAnsi="Calibri"/>
+          <w:sz w:val="8"/>
+          <w:szCs w:val="8"/>
+        </w:rPr>
+        <w:t xml:space="preserve"/>
+      </w:r>
+    </w:p>
+    <w:p>
+      <w:pPr>
+        <w:spacing w:after="80" w:before="280"/>
+      </w:pPr>
+      <w:r>
+        <w:rPr>
+          <w:rFonts w:ascii="Calibri" w:cs="Calibri" w:eastAsia="Calibri" w:hAnsi="Calibri"/>
+          <w:b/>
+          <w:bCs/>
+          <w:color w:val="1B1B1E"/>
+          <w:sz w:val="22"/>
+          <w:szCs w:val="22"/>
+        </w:rPr>
+        <w:t xml:space="preserve">Anything else that took up real time last month, and which column it belongs in.</w:t>
+      </w:r>
+    </w:p>
+    <w:tbl>
+      <w:tblPr>
+        <w:tblW w:type="dxa" w:w="9360"/>
+        <w:tblBorders>
+          <w:top w:val="single" w:color="auto" w:sz="4"/>
+          <w:left w:val="single" w:color="auto" w:sz="4"/>
+          <w:bottom w:val="single" w:color="auto" w:sz="4"/>
+          <w:right w:val="single" w:color="auto" w:sz="4"/>
+          <w:insideH w:val="single" w:color="auto" w:sz="4"/>
+          <w:insideV w:val="single" w:color="auto" w:sz="4"/>
+        </w:tblBorders>
+      </w:tblPr>
+      <w:tblGrid>
+        <w:gridCol w:w="9360"/>
+      </w:tblGrid>
+      <w:tr>
+        <w:trPr>
+          <w:trHeight w:val="1360" w:hRule="atLeast"/>
+        </w:trPr>
+        <w:tc>
+          <w:tcPr>
+            <w:tcW w:type="dxa" w:w="9360"/>
+            <w:tcBorders>
+              <w:top w:val="single" w:color="D1D5DB" w:sz="6"/>
+              <w:left w:val="single" w:color="D1D5DB" w:sz="6"/>
+              <w:bottom w:val="single" w:color="D1D5DB" w:sz="6"/>
+              <w:right w:val="single" w:color="D1D5DB" w:sz="6"/>
+            </w:tcBorders>
+            <w:shd w:fill="FFFFFF" w:color="auto" w:val="clear"/>
+            <w:tcMar>
+              <w:top w:type="dxa" w:w="140"/>
+              <w:left w:type="dxa" w:w="160"/>
+              <w:bottom w:type="dxa" w:w="140"/>
+              <w:right w:type="dxa" w:w="160"/>
+            </w:tcMar>
+          </w:tcPr>
+          <w:p>
+            <w:pPr>
+              <w:spacing w:after="120" w:before="0"/>
+            </w:pPr>
+            <w:r>
+              <w:rPr>
+                <w:rFonts w:ascii="Calibri" w:cs="Calibri" w:eastAsia="Calibri" w:hAnsi="Calibri"/>
+                <w:color w:val="1B1B1E"/>
+                <w:sz w:val="22"/>
+                <w:szCs w:val="22"/>
+              </w:rPr>
+              <w:t xml:space="preserve"> </w:t>
+            </w:r>
+          </w:p>
+        </w:tc>
+      </w:tr>
+    </w:tbl>
+    <w:p>
+      <w:pPr>
+        <w:spacing w:after="200" w:before="0" w:line="120"/>
+      </w:pPr>
+      <w:r>
+        <w:rPr>
+          <w:rFonts w:ascii="Calibri" w:cs="Calibri" w:eastAsia="Calibri" w:hAnsi="Calibri"/>
+          <w:sz w:val="8"/>
+          <w:szCs w:val="8"/>
+        </w:rPr>
+        <w:t xml:space="preserve"/>
+      </w:r>
+    </w:p>
+    <w:p>
+      <w:pPr>
+        <w:spacing w:after="80" w:before="280"/>
+      </w:pPr>
+      <w:r>
+        <w:rPr>
+          <w:rFonts w:ascii="Calibri" w:cs="Calibri" w:eastAsia="Calibri" w:hAnsi="Calibri"/>
+          <w:b/>
+          <w:bCs/>
+          <w:color w:val="1B1B1E"/>
+          <w:sz w:val="22"/>
+          <w:szCs w:val="22"/>
+        </w:rPr>
+        <w:t xml:space="preserve">Now the harder question. Which of the draining ones are you actually good at? Those are the tasks a career quietly gets built on.</w:t>
+      </w:r>
+    </w:p>
+    <w:tbl>
+      <w:tblPr>
+        <w:tblW w:type="dxa" w:w="9360"/>
+        <w:tblBorders>
+          <w:top w:val="single" w:color="auto" w:sz="4"/>
+          <w:left w:val="single" w:color="auto" w:sz="4"/>
+          <w:bottom w:val="single" w:color="auto" w:sz="4"/>
+          <w:right w:val="single" w:color="auto" w:sz="4"/>
+          <w:insideH w:val="single" w:color="auto" w:sz="4"/>
+          <w:insideV w:val="single" w:color="auto" w:sz="4"/>
+        </w:tblBorders>
+      </w:tblPr>
+      <w:tblGrid>
+        <w:gridCol w:w="9360"/>
+      </w:tblGrid>
+      <w:tr>
+        <w:trPr>
+          <w:trHeight w:val="1360" w:hRule="atLeast"/>
+        </w:trPr>
+        <w:tc>
+          <w:tcPr>
+            <w:tcW w:type="dxa" w:w="9360"/>
+            <w:tcBorders>
+              <w:top w:val="single" w:color="D1D5DB" w:sz="6"/>
+              <w:left w:val="single" w:color="D1D5DB" w:sz="6"/>
+              <w:bottom w:val="single" w:color="D1D5DB" w:sz="6"/>
+              <w:right w:val="single" w:color="D1D5DB" w:sz="6"/>
+            </w:tcBorders>
+            <w:shd w:fill="FFFFFF" w:color="auto" w:val="clear"/>
+            <w:tcMar>
+              <w:top w:type="dxa" w:w="140"/>
+              <w:left w:type="dxa" w:w="160"/>
+              <w:bottom w:type="dxa" w:w="140"/>
+              <w:right w:type="dxa" w:w="160"/>
+            </w:tcMar>
+          </w:tcPr>
+          <w:p>
+            <w:pPr>
+              <w:spacing w:after="120" w:before="0"/>
+            </w:pPr>
+            <w:r>
+              <w:rPr>
+                <w:rFonts w:ascii="Calibri" w:cs="Calibri" w:eastAsia="Calibri" w:hAnsi="Calibri"/>
+                <w:color w:val="1B1B1E"/>
+                <w:sz w:val="22"/>
+                <w:szCs w:val="22"/>
+              </w:rPr>
+              <w:t xml:space="preserve"> </w:t>
+            </w:r>
+          </w:p>
+        </w:tc>
+      </w:tr>
+    </w:tbl>
+    <w:p>
+      <w:pPr>
+        <w:spacing w:after="200" w:before="0" w:line="120"/>
+      </w:pPr>
+      <w:r>
+        <w:rPr>
+          <w:rFonts w:ascii="Calibri" w:cs="Calibri" w:eastAsia="Calibri" w:hAnsi="Calibri"/>
+          <w:sz w:val="8"/>
+          <w:szCs w:val="8"/>
+        </w:rPr>
+        <w:t xml:space="preserve"/>
+      </w:r>
+    </w:p>
+    <w:p>
+      <w:pPr>
+        <w:spacing w:after="80" w:before="280"/>
+      </w:pPr>
+      <w:r>
+        <w:rPr>
+          <w:rFonts w:ascii="Calibri" w:cs="Calibri" w:eastAsia="Calibri" w:hAnsi="Calibri"/>
+          <w:b/>
+          <w:bCs/>
+          <w:color w:val="1B1B1E"/>
+          <w:sz w:val="22"/>
+          <w:szCs w:val="22"/>
+        </w:rPr>
+        <w:t xml:space="preserve">Look at the two columns and name the pattern in your own words. Not "working with people", which is too vague. Working with whom, on what, under what conditions?</w:t>
+      </w:r>
+    </w:p>
+    <w:tbl>
+      <w:tblPr>
+        <w:tblW w:type="dxa" w:w="9360"/>
+        <w:tblBorders>
+          <w:top w:val="single" w:color="auto" w:sz="4"/>
+          <w:left w:val="single" w:color="auto" w:sz="4"/>
+          <w:bottom w:val="single" w:color="auto" w:sz="4"/>
+          <w:right w:val="single" w:color="auto" w:sz="4"/>
+          <w:insideH w:val="single" w:color="auto" w:sz="4"/>
+          <w:insideV w:val="single" w:color="auto" w:sz="4"/>
+        </w:tblBorders>
+      </w:tblPr>
+      <w:tblGrid>
+        <w:gridCol w:w="9360"/>
+      </w:tblGrid>
+      <w:tr>
+        <w:trPr>
+          <w:trHeight w:val="1660" w:hRule="atLeast"/>
+        </w:trPr>
+        <w:tc>
+          <w:tcPr>
+            <w:tcW w:type="dxa" w:w="9360"/>
+            <w:tcBorders>
+              <w:top w:val="single" w:color="D1D5DB" w:sz="6"/>
+              <w:left w:val="single" w:color="D1D5DB" w:sz="6"/>
+              <w:bottom w:val="single" w:color="D1D5DB" w:sz="6"/>
+              <w:right w:val="single" w:color="D1D5DB" w:sz="6"/>
+            </w:tcBorders>
+            <w:shd w:fill="FFFFFF" w:color="auto" w:val="clear"/>
+            <w:tcMar>
+              <w:top w:type="dxa" w:w="140"/>
+              <w:left w:type="dxa" w:w="160"/>
+              <w:bottom w:type="dxa" w:w="140"/>
+              <w:right w:type="dxa" w:w="160"/>
+            </w:tcMar>
+          </w:tcPr>
+          <w:p>
+            <w:pPr>
+              <w:spacing w:after="120" w:before="0"/>
+            </w:pPr>
+            <w:r>
+              <w:rPr>
+                <w:rFonts w:ascii="Calibri" w:cs="Calibri" w:eastAsia="Calibri" w:hAnsi="Calibri"/>
+                <w:color w:val="1B1B1E"/>
+                <w:sz w:val="22"/>
+                <w:szCs w:val="22"/>
+              </w:rPr>
+              <w:t xml:space="preserve"> </w:t>
+            </w:r>
+          </w:p>
+        </w:tc>
+      </w:tr>
+    </w:tbl>
+    <w:p>
+      <w:pPr>
+        <w:spacing w:after="200" w:before="0" w:line="120"/>
+      </w:pPr>
+      <w:r>
+        <w:rPr>
+          <w:rFonts w:ascii="Calibri" w:cs="Calibri" w:eastAsia="Calibri" w:hAnsi="Calibri"/>
+          <w:sz w:val="8"/>
+          <w:szCs w:val="8"/>
+        </w:rPr>
+        <w:t xml:space="preserve"/>
+      </w:r>
+    </w:p>
+    <w:p>
+      <w:r>
+        <w:br w:type="page"/>
+      </w:r>
+    </w:p>
+    <w:p>
+      <w:pPr>
+        <w:spacing w:after="60" w:before="120"/>
+      </w:pPr>
+      <w:r>
+        <w:rPr>
+          <w:rFonts w:ascii="Calibri" w:cs="Calibri" w:eastAsia="Calibri" w:hAnsi="Calibri"/>
+          <w:b/>
+          <w:bCs/>
+          <w:color w:val="2D6A4F"/>
+          <w:spacing w:val="30"/>
+          <w:sz w:val="17"/>
+          <w:szCs w:val="17"/>
+        </w:rPr>
+        <w:t xml:space="preserve">MODULE 1 · LESSON 5 · 8 MIN</w:t>
       </w:r>
     </w:p>
     <w:p>
@@ -7954,7 +9232,7 @@
           <w:sz w:val="17"/>
           <w:szCs w:val="17"/>
         </w:rPr>
-        <w:t xml:space="preserve">MODULE 1 · LESSON 5 · 5 MIN</w:t>
+        <w:t xml:space="preserve">MODULE 1 · LESSON 6 · 5 MIN</w:t>
       </w:r>
     </w:p>
     <w:p>
@@ -8436,7 +9714,7 @@
           <w:sz w:val="17"/>
           <w:szCs w:val="17"/>
         </w:rPr>
-        <w:t xml:space="preserve">MODULE 1 · LESSON 6 · 3 MIN</w:t>
+        <w:t xml:space="preserve">MODULE 1 · LESSON 7 · 3 MIN</w:t>
       </w:r>
     </w:p>
     <w:p>
@@ -15192,6 +16470,1165 @@
           <w:szCs w:val="22"/>
         </w:rPr>
         <w:t xml:space="preserve">Say the counter out loud once, to a person. Who did you say it to, and how did it sound?</w:t>
+      </w:r>
+    </w:p>
+    <w:tbl>
+      <w:tblPr>
+        <w:tblW w:type="dxa" w:w="9360"/>
+        <w:tblBorders>
+          <w:top w:val="single" w:color="auto" w:sz="4"/>
+          <w:left w:val="single" w:color="auto" w:sz="4"/>
+          <w:bottom w:val="single" w:color="auto" w:sz="4"/>
+          <w:right w:val="single" w:color="auto" w:sz="4"/>
+          <w:insideH w:val="single" w:color="auto" w:sz="4"/>
+          <w:insideV w:val="single" w:color="auto" w:sz="4"/>
+        </w:tblBorders>
+      </w:tblPr>
+      <w:tblGrid>
+        <w:gridCol w:w="9360"/>
+      </w:tblGrid>
+      <w:tr>
+        <w:trPr>
+          <w:trHeight w:val="1060" w:hRule="atLeast"/>
+        </w:trPr>
+        <w:tc>
+          <w:tcPr>
+            <w:tcW w:type="dxa" w:w="9360"/>
+            <w:tcBorders>
+              <w:top w:val="single" w:color="D1D5DB" w:sz="6"/>
+              <w:left w:val="single" w:color="D1D5DB" w:sz="6"/>
+              <w:bottom w:val="single" w:color="D1D5DB" w:sz="6"/>
+              <w:right w:val="single" w:color="D1D5DB" w:sz="6"/>
+            </w:tcBorders>
+            <w:shd w:fill="FFFFFF" w:color="auto" w:val="clear"/>
+            <w:tcMar>
+              <w:top w:type="dxa" w:w="140"/>
+              <w:left w:type="dxa" w:w="160"/>
+              <w:bottom w:type="dxa" w:w="140"/>
+              <w:right w:type="dxa" w:w="160"/>
+            </w:tcMar>
+          </w:tcPr>
+          <w:p>
+            <w:pPr>
+              <w:spacing w:after="120" w:before="0"/>
+            </w:pPr>
+            <w:r>
+              <w:rPr>
+                <w:rFonts w:ascii="Calibri" w:cs="Calibri" w:eastAsia="Calibri" w:hAnsi="Calibri"/>
+                <w:color w:val="1B1B1E"/>
+                <w:sz w:val="22"/>
+                <w:szCs w:val="22"/>
+              </w:rPr>
+              <w:t xml:space="preserve"> </w:t>
+            </w:r>
+          </w:p>
+        </w:tc>
+      </w:tr>
+    </w:tbl>
+    <w:p>
+      <w:pPr>
+        <w:spacing w:after="200" w:before="0" w:line="120"/>
+      </w:pPr>
+      <w:r>
+        <w:rPr>
+          <w:rFonts w:ascii="Calibri" w:cs="Calibri" w:eastAsia="Calibri" w:hAnsi="Calibri"/>
+          <w:sz w:val="8"/>
+          <w:szCs w:val="8"/>
+        </w:rPr>
+        <w:t xml:space="preserve"/>
+      </w:r>
+    </w:p>
+    <w:p>
+      <w:r>
+        <w:br w:type="page"/>
+      </w:r>
+    </w:p>
+    <w:p>
+      <w:pPr>
+        <w:spacing w:after="60" w:before="120"/>
+      </w:pPr>
+      <w:r>
+        <w:rPr>
+          <w:rFonts w:ascii="Calibri" w:cs="Calibri" w:eastAsia="Calibri" w:hAnsi="Calibri"/>
+          <w:b/>
+          <w:bCs/>
+          <w:color w:val="2D6A4F"/>
+          <w:spacing w:val="30"/>
+          <w:sz w:val="17"/>
+          <w:szCs w:val="17"/>
+        </w:rPr>
+        <w:t xml:space="preserve">ACROSS MODULES 2 TO 5</w:t>
+      </w:r>
+    </w:p>
+    <w:p>
+      <w:pPr>
+        <w:pStyle w:val="Heading1"/>
+        <w:spacing w:after="60" w:before="0"/>
+      </w:pPr>
+      <w:r>
+        <w:rPr>
+          <w:rFonts w:ascii="Georgia" w:cs="Georgia" w:eastAsia="Georgia" w:hAnsi="Georgia"/>
+          <w:b/>
+          <w:bCs/>
+          <w:color w:val="1B1B1E"/>
+          <w:sz w:val="40"/>
+          <w:szCs w:val="40"/>
+        </w:rPr>
+        <w:t xml:space="preserve">The tracker</w:t>
+      </w:r>
+    </w:p>
+    <w:p>
+      <w:pPr>
+        <w:spacing w:after="320" w:before="0"/>
+      </w:pPr>
+      <w:r>
+        <w:rPr>
+          <w:rFonts w:ascii="Calibri" w:cs="Calibri" w:eastAsia="Calibri" w:hAnsi="Calibri"/>
+          <w:color w:val="6B7280"/>
+          <w:sz w:val="22"/>
+          <w:szCs w:val="22"/>
+        </w:rPr>
+        <w:t xml:space="preserve">Two conversations and a ratio. The spreadsheet does the arithmetic; this page is for the part it cannot hold.</w:t>
+      </w:r>
+    </w:p>
+    <w:p>
+      <w:pPr>
+        <w:spacing w:after="120" w:before="0"/>
+      </w:pPr>
+      <w:r>
+        <w:rPr>
+          <w:rFonts w:ascii="Calibri" w:cs="Calibri" w:eastAsia="Calibri" w:hAnsi="Calibri"/>
+          <w:color w:val="6B7280"/>
+          <w:sz w:val="20"/>
+          <w:szCs w:val="20"/>
+        </w:rPr>
+        <w:t xml:space="preserve">Download the three-sheet tracker from the course dashboard and import it into Google Sheets or Notion. Use this page for the thinking behind the rows.</w:t>
+      </w:r>
+    </w:p>
+    <w:p>
+      <w:pPr>
+        <w:pStyle w:val="Heading2"/>
+        <w:spacing w:after="140" w:before="360"/>
+      </w:pPr>
+      <w:r>
+        <w:rPr>
+          <w:rFonts w:ascii="Calibri" w:cs="Calibri" w:eastAsia="Calibri" w:hAnsi="Calibri"/>
+          <w:b/>
+          <w:bCs/>
+          <w:color w:val="1B1B1E"/>
+          <w:sz w:val="24"/>
+          <w:szCs w:val="24"/>
+        </w:rPr>
+        <w:t xml:space="preserve">People</w:t>
+      </w:r>
+    </w:p>
+    <w:tbl>
+      <w:tblPr>
+        <w:tblW w:type="dxa" w:w="9360"/>
+        <w:tblBorders>
+          <w:top w:val="single" w:color="auto" w:sz="4"/>
+          <w:left w:val="single" w:color="auto" w:sz="4"/>
+          <w:bottom w:val="single" w:color="auto" w:sz="4"/>
+          <w:right w:val="single" w:color="auto" w:sz="4"/>
+          <w:insideH w:val="single" w:color="auto" w:sz="4"/>
+          <w:insideV w:val="single" w:color="auto" w:sz="4"/>
+        </w:tblBorders>
+      </w:tblPr>
+      <w:tblGrid>
+        <w:gridCol w:w="3600"/>
+        <w:gridCol w:w="5760"/>
+      </w:tblGrid>
+      <w:tr>
+        <w:trPr>
+          <w:trHeight w:val="640" w:hRule="atLeast"/>
+        </w:trPr>
+        <w:tc>
+          <w:tcPr>
+            <w:tcW w:type="dxa" w:w="3600"/>
+            <w:tcBorders>
+              <w:top w:val="single" w:color="D1D5DB" w:sz="6"/>
+              <w:left w:val="single" w:color="D1D5DB" w:sz="6"/>
+              <w:bottom w:val="single" w:color="D1D5DB" w:sz="6"/>
+              <w:right w:val="single" w:color="D1D5DB" w:sz="6"/>
+            </w:tcBorders>
+            <w:shd w:fill="F0FAF3" w:color="auto" w:val="clear"/>
+            <w:tcMar>
+              <w:top w:type="dxa" w:w="120"/>
+              <w:left w:type="dxa" w:w="160"/>
+              <w:bottom w:type="dxa" w:w="120"/>
+              <w:right w:type="dxa" w:w="160"/>
+            </w:tcMar>
+          </w:tcPr>
+          <w:p>
+            <w:pPr>
+              <w:spacing w:after="120" w:before="0"/>
+            </w:pPr>
+            <w:r>
+              <w:rPr>
+                <w:rFonts w:ascii="Calibri" w:cs="Calibri" w:eastAsia="Calibri" w:hAnsi="Calibri"/>
+                <w:b/>
+                <w:bCs/>
+                <w:color w:val="1B1B1E"/>
+                <w:sz w:val="21"/>
+                <w:szCs w:val="21"/>
+              </w:rPr>
+              <w:t xml:space="preserve">Who I am trying to reach, and why them</w:t>
+            </w:r>
+          </w:p>
+        </w:tc>
+        <w:tc>
+          <w:tcPr>
+            <w:tcW w:type="dxa" w:w="5760"/>
+            <w:tcBorders>
+              <w:top w:val="single" w:color="D1D5DB" w:sz="6"/>
+              <w:left w:val="single" w:color="D1D5DB" w:sz="6"/>
+              <w:bottom w:val="single" w:color="D1D5DB" w:sz="6"/>
+              <w:right w:val="single" w:color="D1D5DB" w:sz="6"/>
+            </w:tcBorders>
+            <w:shd w:fill="FFFFFF" w:color="auto" w:val="clear"/>
+            <w:tcMar>
+              <w:top w:type="dxa" w:w="120"/>
+              <w:left w:type="dxa" w:w="160"/>
+              <w:bottom w:type="dxa" w:w="120"/>
+              <w:right w:type="dxa" w:w="160"/>
+            </w:tcMar>
+          </w:tcPr>
+          <w:p>
+            <w:pPr>
+              <w:spacing w:after="120" w:before="0"/>
+            </w:pPr>
+            <w:r>
+              <w:rPr>
+                <w:rFonts w:ascii="Calibri" w:cs="Calibri" w:eastAsia="Calibri" w:hAnsi="Calibri"/>
+                <w:color w:val="1B1B1E"/>
+                <w:sz w:val="22"/>
+                <w:szCs w:val="22"/>
+              </w:rPr>
+              <w:t xml:space="preserve"> </w:t>
+            </w:r>
+          </w:p>
+        </w:tc>
+      </w:tr>
+      <w:tr>
+        <w:trPr>
+          <w:trHeight w:val="640" w:hRule="atLeast"/>
+        </w:trPr>
+        <w:tc>
+          <w:tcPr>
+            <w:tcW w:type="dxa" w:w="3600"/>
+            <w:tcBorders>
+              <w:top w:val="single" w:color="D1D5DB" w:sz="6"/>
+              <w:left w:val="single" w:color="D1D5DB" w:sz="6"/>
+              <w:bottom w:val="single" w:color="D1D5DB" w:sz="6"/>
+              <w:right w:val="single" w:color="D1D5DB" w:sz="6"/>
+            </w:tcBorders>
+            <w:shd w:fill="F0FAF3" w:color="auto" w:val="clear"/>
+            <w:tcMar>
+              <w:top w:type="dxa" w:w="120"/>
+              <w:left w:type="dxa" w:w="160"/>
+              <w:bottom w:type="dxa" w:w="120"/>
+              <w:right w:type="dxa" w:w="160"/>
+            </w:tcMar>
+          </w:tcPr>
+          <w:p>
+            <w:pPr>
+              <w:spacing w:after="120" w:before="0"/>
+            </w:pPr>
+            <w:r>
+              <w:rPr>
+                <w:rFonts w:ascii="Calibri" w:cs="Calibri" w:eastAsia="Calibri" w:hAnsi="Calibri"/>
+                <w:b/>
+                <w:bCs/>
+                <w:color w:val="1B1B1E"/>
+                <w:sz w:val="21"/>
+                <w:szCs w:val="21"/>
+              </w:rPr>
+              <w:t xml:space="preserve">Messages sent so far</w:t>
+            </w:r>
+          </w:p>
+        </w:tc>
+        <w:tc>
+          <w:tcPr>
+            <w:tcW w:type="dxa" w:w="5760"/>
+            <w:tcBorders>
+              <w:top w:val="single" w:color="D1D5DB" w:sz="6"/>
+              <w:left w:val="single" w:color="D1D5DB" w:sz="6"/>
+              <w:bottom w:val="single" w:color="D1D5DB" w:sz="6"/>
+              <w:right w:val="single" w:color="D1D5DB" w:sz="6"/>
+            </w:tcBorders>
+            <w:shd w:fill="FFFFFF" w:color="auto" w:val="clear"/>
+            <w:tcMar>
+              <w:top w:type="dxa" w:w="120"/>
+              <w:left w:type="dxa" w:w="160"/>
+              <w:bottom w:type="dxa" w:w="120"/>
+              <w:right w:type="dxa" w:w="160"/>
+            </w:tcMar>
+          </w:tcPr>
+          <w:p>
+            <w:pPr>
+              <w:spacing w:after="120" w:before="0"/>
+            </w:pPr>
+            <w:r>
+              <w:rPr>
+                <w:rFonts w:ascii="Calibri" w:cs="Calibri" w:eastAsia="Calibri" w:hAnsi="Calibri"/>
+                <w:color w:val="1B1B1E"/>
+                <w:sz w:val="22"/>
+                <w:szCs w:val="22"/>
+              </w:rPr>
+              <w:t xml:space="preserve"> </w:t>
+            </w:r>
+          </w:p>
+        </w:tc>
+      </w:tr>
+      <w:tr>
+        <w:trPr>
+          <w:trHeight w:val="640" w:hRule="atLeast"/>
+        </w:trPr>
+        <w:tc>
+          <w:tcPr>
+            <w:tcW w:type="dxa" w:w="3600"/>
+            <w:tcBorders>
+              <w:top w:val="single" w:color="D1D5DB" w:sz="6"/>
+              <w:left w:val="single" w:color="D1D5DB" w:sz="6"/>
+              <w:bottom w:val="single" w:color="D1D5DB" w:sz="6"/>
+              <w:right w:val="single" w:color="D1D5DB" w:sz="6"/>
+            </w:tcBorders>
+            <w:shd w:fill="F0FAF3" w:color="auto" w:val="clear"/>
+            <w:tcMar>
+              <w:top w:type="dxa" w:w="120"/>
+              <w:left w:type="dxa" w:w="160"/>
+              <w:bottom w:type="dxa" w:w="120"/>
+              <w:right w:type="dxa" w:w="160"/>
+            </w:tcMar>
+          </w:tcPr>
+          <w:p>
+            <w:pPr>
+              <w:spacing w:after="120" w:before="0"/>
+            </w:pPr>
+            <w:r>
+              <w:rPr>
+                <w:rFonts w:ascii="Calibri" w:cs="Calibri" w:eastAsia="Calibri" w:hAnsi="Calibri"/>
+                <w:b/>
+                <w:bCs/>
+                <w:color w:val="1B1B1E"/>
+                <w:sz w:val="21"/>
+                <w:szCs w:val="21"/>
+              </w:rPr>
+              <w:t xml:space="preserve">Replies</w:t>
+            </w:r>
+          </w:p>
+          <w:p>
+            <w:pPr>
+              <w:spacing w:after="0" w:before="0"/>
+            </w:pPr>
+            <w:r>
+              <w:rPr>
+                <w:rFonts w:ascii="Calibri" w:cs="Calibri" w:eastAsia="Calibri" w:hAnsi="Calibri"/>
+                <w:color w:val="6B7280"/>
+                <w:sz w:val="18"/>
+                <w:szCs w:val="18"/>
+              </w:rPr>
+              <w:t xml:space="preserve">About one in four gets no answer</w:t>
+            </w:r>
+          </w:p>
+        </w:tc>
+        <w:tc>
+          <w:tcPr>
+            <w:tcW w:type="dxa" w:w="5760"/>
+            <w:tcBorders>
+              <w:top w:val="single" w:color="D1D5DB" w:sz="6"/>
+              <w:left w:val="single" w:color="D1D5DB" w:sz="6"/>
+              <w:bottom w:val="single" w:color="D1D5DB" w:sz="6"/>
+              <w:right w:val="single" w:color="D1D5DB" w:sz="6"/>
+            </w:tcBorders>
+            <w:shd w:fill="FFFFFF" w:color="auto" w:val="clear"/>
+            <w:tcMar>
+              <w:top w:type="dxa" w:w="120"/>
+              <w:left w:type="dxa" w:w="160"/>
+              <w:bottom w:type="dxa" w:w="120"/>
+              <w:right w:type="dxa" w:w="160"/>
+            </w:tcMar>
+          </w:tcPr>
+          <w:p>
+            <w:pPr>
+              <w:spacing w:after="120" w:before="0"/>
+            </w:pPr>
+            <w:r>
+              <w:rPr>
+                <w:rFonts w:ascii="Calibri" w:cs="Calibri" w:eastAsia="Calibri" w:hAnsi="Calibri"/>
+                <w:color w:val="1B1B1E"/>
+                <w:sz w:val="22"/>
+                <w:szCs w:val="22"/>
+              </w:rPr>
+              <w:t xml:space="preserve"> </w:t>
+            </w:r>
+          </w:p>
+        </w:tc>
+      </w:tr>
+      <w:tr>
+        <w:trPr>
+          <w:trHeight w:val="640" w:hRule="atLeast"/>
+        </w:trPr>
+        <w:tc>
+          <w:tcPr>
+            <w:tcW w:type="dxa" w:w="3600"/>
+            <w:tcBorders>
+              <w:top w:val="single" w:color="D1D5DB" w:sz="6"/>
+              <w:left w:val="single" w:color="D1D5DB" w:sz="6"/>
+              <w:bottom w:val="single" w:color="D1D5DB" w:sz="6"/>
+              <w:right w:val="single" w:color="D1D5DB" w:sz="6"/>
+            </w:tcBorders>
+            <w:shd w:fill="F0FAF3" w:color="auto" w:val="clear"/>
+            <w:tcMar>
+              <w:top w:type="dxa" w:w="120"/>
+              <w:left w:type="dxa" w:w="160"/>
+              <w:bottom w:type="dxa" w:w="120"/>
+              <w:right w:type="dxa" w:w="160"/>
+            </w:tcMar>
+          </w:tcPr>
+          <w:p>
+            <w:pPr>
+              <w:spacing w:after="120" w:before="0"/>
+            </w:pPr>
+            <w:r>
+              <w:rPr>
+                <w:rFonts w:ascii="Calibri" w:cs="Calibri" w:eastAsia="Calibri" w:hAnsi="Calibri"/>
+                <w:b/>
+                <w:bCs/>
+                <w:color w:val="1B1B1E"/>
+                <w:sz w:val="21"/>
+                <w:szCs w:val="21"/>
+              </w:rPr>
+              <w:t xml:space="preserve">Conversations had</w:t>
+            </w:r>
+          </w:p>
+        </w:tc>
+        <w:tc>
+          <w:tcPr>
+            <w:tcW w:type="dxa" w:w="5760"/>
+            <w:tcBorders>
+              <w:top w:val="single" w:color="D1D5DB" w:sz="6"/>
+              <w:left w:val="single" w:color="D1D5DB" w:sz="6"/>
+              <w:bottom w:val="single" w:color="D1D5DB" w:sz="6"/>
+              <w:right w:val="single" w:color="D1D5DB" w:sz="6"/>
+            </w:tcBorders>
+            <w:shd w:fill="FFFFFF" w:color="auto" w:val="clear"/>
+            <w:tcMar>
+              <w:top w:type="dxa" w:w="120"/>
+              <w:left w:type="dxa" w:w="160"/>
+              <w:bottom w:type="dxa" w:w="120"/>
+              <w:right w:type="dxa" w:w="160"/>
+            </w:tcMar>
+          </w:tcPr>
+          <w:p>
+            <w:pPr>
+              <w:spacing w:after="120" w:before="0"/>
+            </w:pPr>
+            <w:r>
+              <w:rPr>
+                <w:rFonts w:ascii="Calibri" w:cs="Calibri" w:eastAsia="Calibri" w:hAnsi="Calibri"/>
+                <w:color w:val="1B1B1E"/>
+                <w:sz w:val="22"/>
+                <w:szCs w:val="22"/>
+              </w:rPr>
+              <w:t xml:space="preserve"> </w:t>
+            </w:r>
+          </w:p>
+        </w:tc>
+      </w:tr>
+      <w:tr>
+        <w:trPr>
+          <w:trHeight w:val="640" w:hRule="atLeast"/>
+        </w:trPr>
+        <w:tc>
+          <w:tcPr>
+            <w:tcW w:type="dxa" w:w="3600"/>
+            <w:tcBorders>
+              <w:top w:val="single" w:color="D1D5DB" w:sz="6"/>
+              <w:left w:val="single" w:color="D1D5DB" w:sz="6"/>
+              <w:bottom w:val="single" w:color="D1D5DB" w:sz="6"/>
+              <w:right w:val="single" w:color="D1D5DB" w:sz="6"/>
+            </w:tcBorders>
+            <w:shd w:fill="F0FAF3" w:color="auto" w:val="clear"/>
+            <w:tcMar>
+              <w:top w:type="dxa" w:w="120"/>
+              <w:left w:type="dxa" w:w="160"/>
+              <w:bottom w:type="dxa" w:w="120"/>
+              <w:right w:type="dxa" w:w="160"/>
+            </w:tcMar>
+          </w:tcPr>
+          <w:p>
+            <w:pPr>
+              <w:spacing w:after="120" w:before="0"/>
+            </w:pPr>
+            <w:r>
+              <w:rPr>
+                <w:rFonts w:ascii="Calibri" w:cs="Calibri" w:eastAsia="Calibri" w:hAnsi="Calibri"/>
+                <w:b/>
+                <w:bCs/>
+                <w:color w:val="1B1B1E"/>
+                <w:sz w:val="21"/>
+                <w:szCs w:val="21"/>
+              </w:rPr>
+              <w:t xml:space="preserve">Names I was given</w:t>
+            </w:r>
+          </w:p>
+          <w:p>
+            <w:pPr>
+              <w:spacing w:after="0" w:before="0"/>
+            </w:pPr>
+            <w:r>
+              <w:rPr>
+                <w:rFonts w:ascii="Calibri" w:cs="Calibri" w:eastAsia="Calibri" w:hAnsi="Calibri"/>
+                <w:color w:val="6B7280"/>
+                <w:sz w:val="18"/>
+                <w:szCs w:val="18"/>
+              </w:rPr>
+              <w:t xml:space="preserve">This column is where a network comes from</w:t>
+            </w:r>
+          </w:p>
+        </w:tc>
+        <w:tc>
+          <w:tcPr>
+            <w:tcW w:type="dxa" w:w="5760"/>
+            <w:tcBorders>
+              <w:top w:val="single" w:color="D1D5DB" w:sz="6"/>
+              <w:left w:val="single" w:color="D1D5DB" w:sz="6"/>
+              <w:bottom w:val="single" w:color="D1D5DB" w:sz="6"/>
+              <w:right w:val="single" w:color="D1D5DB" w:sz="6"/>
+            </w:tcBorders>
+            <w:shd w:fill="FFFFFF" w:color="auto" w:val="clear"/>
+            <w:tcMar>
+              <w:top w:type="dxa" w:w="120"/>
+              <w:left w:type="dxa" w:w="160"/>
+              <w:bottom w:type="dxa" w:w="120"/>
+              <w:right w:type="dxa" w:w="160"/>
+            </w:tcMar>
+          </w:tcPr>
+          <w:p>
+            <w:pPr>
+              <w:spacing w:after="120" w:before="0"/>
+            </w:pPr>
+            <w:r>
+              <w:rPr>
+                <w:rFonts w:ascii="Calibri" w:cs="Calibri" w:eastAsia="Calibri" w:hAnsi="Calibri"/>
+                <w:color w:val="1B1B1E"/>
+                <w:sz w:val="22"/>
+                <w:szCs w:val="22"/>
+              </w:rPr>
+              <w:t xml:space="preserve"> </w:t>
+            </w:r>
+          </w:p>
+        </w:tc>
+      </w:tr>
+    </w:tbl>
+    <w:p>
+      <w:pPr>
+        <w:spacing w:after="200" w:before="0" w:line="120"/>
+      </w:pPr>
+      <w:r>
+        <w:rPr>
+          <w:rFonts w:ascii="Calibri" w:cs="Calibri" w:eastAsia="Calibri" w:hAnsi="Calibri"/>
+          <w:sz w:val="8"/>
+          <w:szCs w:val="8"/>
+        </w:rPr>
+        <w:t xml:space="preserve"/>
+      </w:r>
+    </w:p>
+    <w:p>
+      <w:pPr>
+        <w:spacing w:after="80" w:before="280"/>
+      </w:pPr>
+      <w:r>
+        <w:rPr>
+          <w:rFonts w:ascii="Calibri" w:cs="Calibri" w:eastAsia="Calibri" w:hAnsi="Calibri"/>
+          <w:b/>
+          <w:bCs/>
+          <w:color w:val="1B1B1E"/>
+          <w:sz w:val="22"/>
+          <w:szCs w:val="22"/>
+        </w:rPr>
+        <w:t xml:space="preserve">The most useful thing anyone has told me so far, and what I did about it.</w:t>
+      </w:r>
+    </w:p>
+    <w:tbl>
+      <w:tblPr>
+        <w:tblW w:type="dxa" w:w="9360"/>
+        <w:tblBorders>
+          <w:top w:val="single" w:color="auto" w:sz="4"/>
+          <w:left w:val="single" w:color="auto" w:sz="4"/>
+          <w:bottom w:val="single" w:color="auto" w:sz="4"/>
+          <w:right w:val="single" w:color="auto" w:sz="4"/>
+          <w:insideH w:val="single" w:color="auto" w:sz="4"/>
+          <w:insideV w:val="single" w:color="auto" w:sz="4"/>
+        </w:tblBorders>
+      </w:tblPr>
+      <w:tblGrid>
+        <w:gridCol w:w="9360"/>
+      </w:tblGrid>
+      <w:tr>
+        <w:trPr>
+          <w:trHeight w:val="1360" w:hRule="atLeast"/>
+        </w:trPr>
+        <w:tc>
+          <w:tcPr>
+            <w:tcW w:type="dxa" w:w="9360"/>
+            <w:tcBorders>
+              <w:top w:val="single" w:color="D1D5DB" w:sz="6"/>
+              <w:left w:val="single" w:color="D1D5DB" w:sz="6"/>
+              <w:bottom w:val="single" w:color="D1D5DB" w:sz="6"/>
+              <w:right w:val="single" w:color="D1D5DB" w:sz="6"/>
+            </w:tcBorders>
+            <w:shd w:fill="FFFFFF" w:color="auto" w:val="clear"/>
+            <w:tcMar>
+              <w:top w:type="dxa" w:w="140"/>
+              <w:left w:type="dxa" w:w="160"/>
+              <w:bottom w:type="dxa" w:w="140"/>
+              <w:right w:type="dxa" w:w="160"/>
+            </w:tcMar>
+          </w:tcPr>
+          <w:p>
+            <w:pPr>
+              <w:spacing w:after="120" w:before="0"/>
+            </w:pPr>
+            <w:r>
+              <w:rPr>
+                <w:rFonts w:ascii="Calibri" w:cs="Calibri" w:eastAsia="Calibri" w:hAnsi="Calibri"/>
+                <w:color w:val="1B1B1E"/>
+                <w:sz w:val="22"/>
+                <w:szCs w:val="22"/>
+              </w:rPr>
+              <w:t xml:space="preserve"> </w:t>
+            </w:r>
+          </w:p>
+        </w:tc>
+      </w:tr>
+    </w:tbl>
+    <w:p>
+      <w:pPr>
+        <w:spacing w:after="200" w:before="0" w:line="120"/>
+      </w:pPr>
+      <w:r>
+        <w:rPr>
+          <w:rFonts w:ascii="Calibri" w:cs="Calibri" w:eastAsia="Calibri" w:hAnsi="Calibri"/>
+          <w:sz w:val="8"/>
+          <w:szCs w:val="8"/>
+        </w:rPr>
+        <w:t xml:space="preserve"/>
+      </w:r>
+    </w:p>
+    <w:p>
+      <w:pPr>
+        <w:pStyle w:val="Heading2"/>
+        <w:spacing w:after="140" w:before="360"/>
+      </w:pPr>
+      <w:r>
+        <w:rPr>
+          <w:rFonts w:ascii="Calibri" w:cs="Calibri" w:eastAsia="Calibri" w:hAnsi="Calibri"/>
+          <w:b/>
+          <w:bCs/>
+          <w:color w:val="1B1B1E"/>
+          <w:sz w:val="24"/>
+          <w:szCs w:val="24"/>
+        </w:rPr>
+        <w:t xml:space="preserve">Applications</w:t>
+      </w:r>
+    </w:p>
+    <w:tbl>
+      <w:tblPr>
+        <w:tblW w:type="dxa" w:w="9360"/>
+        <w:tblBorders>
+          <w:top w:val="single" w:color="auto" w:sz="4"/>
+          <w:left w:val="single" w:color="auto" w:sz="4"/>
+          <w:bottom w:val="single" w:color="auto" w:sz="4"/>
+          <w:right w:val="single" w:color="auto" w:sz="4"/>
+          <w:insideH w:val="single" w:color="auto" w:sz="4"/>
+          <w:insideV w:val="single" w:color="auto" w:sz="4"/>
+        </w:tblBorders>
+      </w:tblPr>
+      <w:tblGrid>
+        <w:gridCol w:w="3600"/>
+        <w:gridCol w:w="5760"/>
+      </w:tblGrid>
+      <w:tr>
+        <w:trPr>
+          <w:trHeight w:val="640" w:hRule="atLeast"/>
+        </w:trPr>
+        <w:tc>
+          <w:tcPr>
+            <w:tcW w:type="dxa" w:w="3600"/>
+            <w:tcBorders>
+              <w:top w:val="single" w:color="D1D5DB" w:sz="6"/>
+              <w:left w:val="single" w:color="D1D5DB" w:sz="6"/>
+              <w:bottom w:val="single" w:color="D1D5DB" w:sz="6"/>
+              <w:right w:val="single" w:color="D1D5DB" w:sz="6"/>
+            </w:tcBorders>
+            <w:shd w:fill="F0FAF3" w:color="auto" w:val="clear"/>
+            <w:tcMar>
+              <w:top w:type="dxa" w:w="120"/>
+              <w:left w:type="dxa" w:w="160"/>
+              <w:bottom w:type="dxa" w:w="120"/>
+              <w:right w:type="dxa" w:w="160"/>
+            </w:tcMar>
+          </w:tcPr>
+          <w:p>
+            <w:pPr>
+              <w:spacing w:after="120" w:before="0"/>
+            </w:pPr>
+            <w:r>
+              <w:rPr>
+                <w:rFonts w:ascii="Calibri" w:cs="Calibri" w:eastAsia="Calibri" w:hAnsi="Calibri"/>
+                <w:b/>
+                <w:bCs/>
+                <w:color w:val="1B1B1E"/>
+                <w:sz w:val="21"/>
+                <w:szCs w:val="21"/>
+              </w:rPr>
+              <w:t xml:space="preserve">Applications sent</w:t>
+            </w:r>
+          </w:p>
+        </w:tc>
+        <w:tc>
+          <w:tcPr>
+            <w:tcW w:type="dxa" w:w="5760"/>
+            <w:tcBorders>
+              <w:top w:val="single" w:color="D1D5DB" w:sz="6"/>
+              <w:left w:val="single" w:color="D1D5DB" w:sz="6"/>
+              <w:bottom w:val="single" w:color="D1D5DB" w:sz="6"/>
+              <w:right w:val="single" w:color="D1D5DB" w:sz="6"/>
+            </w:tcBorders>
+            <w:shd w:fill="FFFFFF" w:color="auto" w:val="clear"/>
+            <w:tcMar>
+              <w:top w:type="dxa" w:w="120"/>
+              <w:left w:type="dxa" w:w="160"/>
+              <w:bottom w:type="dxa" w:w="120"/>
+              <w:right w:type="dxa" w:w="160"/>
+            </w:tcMar>
+          </w:tcPr>
+          <w:p>
+            <w:pPr>
+              <w:spacing w:after="120" w:before="0"/>
+            </w:pPr>
+            <w:r>
+              <w:rPr>
+                <w:rFonts w:ascii="Calibri" w:cs="Calibri" w:eastAsia="Calibri" w:hAnsi="Calibri"/>
+                <w:color w:val="1B1B1E"/>
+                <w:sz w:val="22"/>
+                <w:szCs w:val="22"/>
+              </w:rPr>
+              <w:t xml:space="preserve"> </w:t>
+            </w:r>
+          </w:p>
+        </w:tc>
+      </w:tr>
+      <w:tr>
+        <w:trPr>
+          <w:trHeight w:val="640" w:hRule="atLeast"/>
+        </w:trPr>
+        <w:tc>
+          <w:tcPr>
+            <w:tcW w:type="dxa" w:w="3600"/>
+            <w:tcBorders>
+              <w:top w:val="single" w:color="D1D5DB" w:sz="6"/>
+              <w:left w:val="single" w:color="D1D5DB" w:sz="6"/>
+              <w:bottom w:val="single" w:color="D1D5DB" w:sz="6"/>
+              <w:right w:val="single" w:color="D1D5DB" w:sz="6"/>
+            </w:tcBorders>
+            <w:shd w:fill="F0FAF3" w:color="auto" w:val="clear"/>
+            <w:tcMar>
+              <w:top w:type="dxa" w:w="120"/>
+              <w:left w:type="dxa" w:w="160"/>
+              <w:bottom w:type="dxa" w:w="120"/>
+              <w:right w:type="dxa" w:w="160"/>
+            </w:tcMar>
+          </w:tcPr>
+          <w:p>
+            <w:pPr>
+              <w:spacing w:after="120" w:before="0"/>
+            </w:pPr>
+            <w:r>
+              <w:rPr>
+                <w:rFonts w:ascii="Calibri" w:cs="Calibri" w:eastAsia="Calibri" w:hAnsi="Calibri"/>
+                <w:b/>
+                <w:bCs/>
+                <w:color w:val="1B1B1E"/>
+                <w:sz w:val="21"/>
+                <w:szCs w:val="21"/>
+              </w:rPr>
+              <w:t xml:space="preserve">Screens</w:t>
+            </w:r>
+          </w:p>
+        </w:tc>
+        <w:tc>
+          <w:tcPr>
+            <w:tcW w:type="dxa" w:w="5760"/>
+            <w:tcBorders>
+              <w:top w:val="single" w:color="D1D5DB" w:sz="6"/>
+              <w:left w:val="single" w:color="D1D5DB" w:sz="6"/>
+              <w:bottom w:val="single" w:color="D1D5DB" w:sz="6"/>
+              <w:right w:val="single" w:color="D1D5DB" w:sz="6"/>
+            </w:tcBorders>
+            <w:shd w:fill="FFFFFF" w:color="auto" w:val="clear"/>
+            <w:tcMar>
+              <w:top w:type="dxa" w:w="120"/>
+              <w:left w:type="dxa" w:w="160"/>
+              <w:bottom w:type="dxa" w:w="120"/>
+              <w:right w:type="dxa" w:w="160"/>
+            </w:tcMar>
+          </w:tcPr>
+          <w:p>
+            <w:pPr>
+              <w:spacing w:after="120" w:before="0"/>
+            </w:pPr>
+            <w:r>
+              <w:rPr>
+                <w:rFonts w:ascii="Calibri" w:cs="Calibri" w:eastAsia="Calibri" w:hAnsi="Calibri"/>
+                <w:color w:val="1B1B1E"/>
+                <w:sz w:val="22"/>
+                <w:szCs w:val="22"/>
+              </w:rPr>
+              <w:t xml:space="preserve"> </w:t>
+            </w:r>
+          </w:p>
+        </w:tc>
+      </w:tr>
+      <w:tr>
+        <w:trPr>
+          <w:trHeight w:val="640" w:hRule="atLeast"/>
+        </w:trPr>
+        <w:tc>
+          <w:tcPr>
+            <w:tcW w:type="dxa" w:w="3600"/>
+            <w:tcBorders>
+              <w:top w:val="single" w:color="D1D5DB" w:sz="6"/>
+              <w:left w:val="single" w:color="D1D5DB" w:sz="6"/>
+              <w:bottom w:val="single" w:color="D1D5DB" w:sz="6"/>
+              <w:right w:val="single" w:color="D1D5DB" w:sz="6"/>
+            </w:tcBorders>
+            <w:shd w:fill="F0FAF3" w:color="auto" w:val="clear"/>
+            <w:tcMar>
+              <w:top w:type="dxa" w:w="120"/>
+              <w:left w:type="dxa" w:w="160"/>
+              <w:bottom w:type="dxa" w:w="120"/>
+              <w:right w:type="dxa" w:w="160"/>
+            </w:tcMar>
+          </w:tcPr>
+          <w:p>
+            <w:pPr>
+              <w:spacing w:after="120" w:before="0"/>
+            </w:pPr>
+            <w:r>
+              <w:rPr>
+                <w:rFonts w:ascii="Calibri" w:cs="Calibri" w:eastAsia="Calibri" w:hAnsi="Calibri"/>
+                <w:b/>
+                <w:bCs/>
+                <w:color w:val="1B1B1E"/>
+                <w:sz w:val="21"/>
+                <w:szCs w:val="21"/>
+              </w:rPr>
+              <w:t xml:space="preserve">Interviews</w:t>
+            </w:r>
+          </w:p>
+        </w:tc>
+        <w:tc>
+          <w:tcPr>
+            <w:tcW w:type="dxa" w:w="5760"/>
+            <w:tcBorders>
+              <w:top w:val="single" w:color="D1D5DB" w:sz="6"/>
+              <w:left w:val="single" w:color="D1D5DB" w:sz="6"/>
+              <w:bottom w:val="single" w:color="D1D5DB" w:sz="6"/>
+              <w:right w:val="single" w:color="D1D5DB" w:sz="6"/>
+            </w:tcBorders>
+            <w:shd w:fill="FFFFFF" w:color="auto" w:val="clear"/>
+            <w:tcMar>
+              <w:top w:type="dxa" w:w="120"/>
+              <w:left w:type="dxa" w:w="160"/>
+              <w:bottom w:type="dxa" w:w="120"/>
+              <w:right w:type="dxa" w:w="160"/>
+            </w:tcMar>
+          </w:tcPr>
+          <w:p>
+            <w:pPr>
+              <w:spacing w:after="120" w:before="0"/>
+            </w:pPr>
+            <w:r>
+              <w:rPr>
+                <w:rFonts w:ascii="Calibri" w:cs="Calibri" w:eastAsia="Calibri" w:hAnsi="Calibri"/>
+                <w:color w:val="1B1B1E"/>
+                <w:sz w:val="22"/>
+                <w:szCs w:val="22"/>
+              </w:rPr>
+              <w:t xml:space="preserve"> </w:t>
+            </w:r>
+          </w:p>
+        </w:tc>
+      </w:tr>
+      <w:tr>
+        <w:trPr>
+          <w:trHeight w:val="640" w:hRule="atLeast"/>
+        </w:trPr>
+        <w:tc>
+          <w:tcPr>
+            <w:tcW w:type="dxa" w:w="3600"/>
+            <w:tcBorders>
+              <w:top w:val="single" w:color="D1D5DB" w:sz="6"/>
+              <w:left w:val="single" w:color="D1D5DB" w:sz="6"/>
+              <w:bottom w:val="single" w:color="D1D5DB" w:sz="6"/>
+              <w:right w:val="single" w:color="D1D5DB" w:sz="6"/>
+            </w:tcBorders>
+            <w:shd w:fill="F0FAF3" w:color="auto" w:val="clear"/>
+            <w:tcMar>
+              <w:top w:type="dxa" w:w="120"/>
+              <w:left w:type="dxa" w:w="160"/>
+              <w:bottom w:type="dxa" w:w="120"/>
+              <w:right w:type="dxa" w:w="160"/>
+            </w:tcMar>
+          </w:tcPr>
+          <w:p>
+            <w:pPr>
+              <w:spacing w:after="120" w:before="0"/>
+            </w:pPr>
+            <w:r>
+              <w:rPr>
+                <w:rFonts w:ascii="Calibri" w:cs="Calibri" w:eastAsia="Calibri" w:hAnsi="Calibri"/>
+                <w:b/>
+                <w:bCs/>
+                <w:color w:val="1B1B1E"/>
+                <w:sz w:val="21"/>
+                <w:szCs w:val="21"/>
+              </w:rPr>
+              <w:t xml:space="preserve">Offers</w:t>
+            </w:r>
+          </w:p>
+        </w:tc>
+        <w:tc>
+          <w:tcPr>
+            <w:tcW w:type="dxa" w:w="5760"/>
+            <w:tcBorders>
+              <w:top w:val="single" w:color="D1D5DB" w:sz="6"/>
+              <w:left w:val="single" w:color="D1D5DB" w:sz="6"/>
+              <w:bottom w:val="single" w:color="D1D5DB" w:sz="6"/>
+              <w:right w:val="single" w:color="D1D5DB" w:sz="6"/>
+            </w:tcBorders>
+            <w:shd w:fill="FFFFFF" w:color="auto" w:val="clear"/>
+            <w:tcMar>
+              <w:top w:type="dxa" w:w="120"/>
+              <w:left w:type="dxa" w:w="160"/>
+              <w:bottom w:type="dxa" w:w="120"/>
+              <w:right w:type="dxa" w:w="160"/>
+            </w:tcMar>
+          </w:tcPr>
+          <w:p>
+            <w:pPr>
+              <w:spacing w:after="120" w:before="0"/>
+            </w:pPr>
+            <w:r>
+              <w:rPr>
+                <w:rFonts w:ascii="Calibri" w:cs="Calibri" w:eastAsia="Calibri" w:hAnsi="Calibri"/>
+                <w:color w:val="1B1B1E"/>
+                <w:sz w:val="22"/>
+                <w:szCs w:val="22"/>
+              </w:rPr>
+              <w:t xml:space="preserve"> </w:t>
+            </w:r>
+          </w:p>
+        </w:tc>
+      </w:tr>
+      <w:tr>
+        <w:trPr>
+          <w:trHeight w:val="640" w:hRule="atLeast"/>
+        </w:trPr>
+        <w:tc>
+          <w:tcPr>
+            <w:tcW w:type="dxa" w:w="3600"/>
+            <w:tcBorders>
+              <w:top w:val="single" w:color="D1D5DB" w:sz="6"/>
+              <w:left w:val="single" w:color="D1D5DB" w:sz="6"/>
+              <w:bottom w:val="single" w:color="D1D5DB" w:sz="6"/>
+              <w:right w:val="single" w:color="D1D5DB" w:sz="6"/>
+            </w:tcBorders>
+            <w:shd w:fill="F0FAF3" w:color="auto" w:val="clear"/>
+            <w:tcMar>
+              <w:top w:type="dxa" w:w="120"/>
+              <w:left w:type="dxa" w:w="160"/>
+              <w:bottom w:type="dxa" w:w="120"/>
+              <w:right w:type="dxa" w:w="160"/>
+            </w:tcMar>
+          </w:tcPr>
+          <w:p>
+            <w:pPr>
+              <w:spacing w:after="120" w:before="0"/>
+            </w:pPr>
+            <w:r>
+              <w:rPr>
+                <w:rFonts w:ascii="Calibri" w:cs="Calibri" w:eastAsia="Calibri" w:hAnsi="Calibri"/>
+                <w:b/>
+                <w:bCs/>
+                <w:color w:val="1B1B1E"/>
+                <w:sz w:val="21"/>
+                <w:szCs w:val="21"/>
+              </w:rPr>
+              <w:t xml:space="preserve">My ratio, so far</w:t>
+            </w:r>
+          </w:p>
+          <w:p>
+            <w:pPr>
+              <w:spacing w:after="0" w:before="0"/>
+            </w:pPr>
+            <w:r>
+              <w:rPr>
+                <w:rFonts w:ascii="Calibri" w:cs="Calibri" w:eastAsia="Calibri" w:hAnsi="Calibri"/>
+                <w:color w:val="6B7280"/>
+                <w:sz w:val="18"/>
+                <w:szCs w:val="18"/>
+              </w:rPr>
+              <w:t xml:space="preserve">113 to 7 to 1 is one documented transition</w:t>
+            </w:r>
+          </w:p>
+        </w:tc>
+        <w:tc>
+          <w:tcPr>
+            <w:tcW w:type="dxa" w:w="5760"/>
+            <w:tcBorders>
+              <w:top w:val="single" w:color="D1D5DB" w:sz="6"/>
+              <w:left w:val="single" w:color="D1D5DB" w:sz="6"/>
+              <w:bottom w:val="single" w:color="D1D5DB" w:sz="6"/>
+              <w:right w:val="single" w:color="D1D5DB" w:sz="6"/>
+            </w:tcBorders>
+            <w:shd w:fill="FFFFFF" w:color="auto" w:val="clear"/>
+            <w:tcMar>
+              <w:top w:type="dxa" w:w="120"/>
+              <w:left w:type="dxa" w:w="160"/>
+              <w:bottom w:type="dxa" w:w="120"/>
+              <w:right w:type="dxa" w:w="160"/>
+            </w:tcMar>
+          </w:tcPr>
+          <w:p>
+            <w:pPr>
+              <w:spacing w:after="120" w:before="0"/>
+            </w:pPr>
+            <w:r>
+              <w:rPr>
+                <w:rFonts w:ascii="Calibri" w:cs="Calibri" w:eastAsia="Calibri" w:hAnsi="Calibri"/>
+                <w:color w:val="1B1B1E"/>
+                <w:sz w:val="22"/>
+                <w:szCs w:val="22"/>
+              </w:rPr>
+              <w:t xml:space="preserve"> </w:t>
+            </w:r>
+          </w:p>
+        </w:tc>
+      </w:tr>
+    </w:tbl>
+    <w:p>
+      <w:pPr>
+        <w:spacing w:after="200" w:before="0" w:line="120"/>
+      </w:pPr>
+      <w:r>
+        <w:rPr>
+          <w:rFonts w:ascii="Calibri" w:cs="Calibri" w:eastAsia="Calibri" w:hAnsi="Calibri"/>
+          <w:sz w:val="8"/>
+          <w:szCs w:val="8"/>
+        </w:rPr>
+        <w:t xml:space="preserve"/>
+      </w:r>
+    </w:p>
+    <w:p>
+      <w:pPr>
+        <w:spacing w:after="80" w:before="280"/>
+      </w:pPr>
+      <w:r>
+        <w:rPr>
+          <w:rFonts w:ascii="Calibri" w:cs="Calibri" w:eastAsia="Calibri" w:hAnsi="Calibri"/>
+          <w:b/>
+          <w:bCs/>
+          <w:color w:val="1B1B1E"/>
+          <w:sz w:val="22"/>
+          <w:szCs w:val="22"/>
+        </w:rPr>
+        <w:t xml:space="preserve">Which stage is actually broken? Applications without screens is a résumé problem, screens without interviews is a bridge-statement problem, interviews without offers is usually a proof problem.</w:t>
+      </w:r>
+    </w:p>
+    <w:tbl>
+      <w:tblPr>
+        <w:tblW w:type="dxa" w:w="9360"/>
+        <w:tblBorders>
+          <w:top w:val="single" w:color="auto" w:sz="4"/>
+          <w:left w:val="single" w:color="auto" w:sz="4"/>
+          <w:bottom w:val="single" w:color="auto" w:sz="4"/>
+          <w:right w:val="single" w:color="auto" w:sz="4"/>
+          <w:insideH w:val="single" w:color="auto" w:sz="4"/>
+          <w:insideV w:val="single" w:color="auto" w:sz="4"/>
+        </w:tblBorders>
+      </w:tblPr>
+      <w:tblGrid>
+        <w:gridCol w:w="9360"/>
+      </w:tblGrid>
+      <w:tr>
+        <w:trPr>
+          <w:trHeight w:val="1660" w:hRule="atLeast"/>
+        </w:trPr>
+        <w:tc>
+          <w:tcPr>
+            <w:tcW w:type="dxa" w:w="9360"/>
+            <w:tcBorders>
+              <w:top w:val="single" w:color="D1D5DB" w:sz="6"/>
+              <w:left w:val="single" w:color="D1D5DB" w:sz="6"/>
+              <w:bottom w:val="single" w:color="D1D5DB" w:sz="6"/>
+              <w:right w:val="single" w:color="D1D5DB" w:sz="6"/>
+            </w:tcBorders>
+            <w:shd w:fill="FFFFFF" w:color="auto" w:val="clear"/>
+            <w:tcMar>
+              <w:top w:type="dxa" w:w="140"/>
+              <w:left w:type="dxa" w:w="160"/>
+              <w:bottom w:type="dxa" w:w="140"/>
+              <w:right w:type="dxa" w:w="160"/>
+            </w:tcMar>
+          </w:tcPr>
+          <w:p>
+            <w:pPr>
+              <w:spacing w:after="120" w:before="0"/>
+            </w:pPr>
+            <w:r>
+              <w:rPr>
+                <w:rFonts w:ascii="Calibri" w:cs="Calibri" w:eastAsia="Calibri" w:hAnsi="Calibri"/>
+                <w:color w:val="1B1B1E"/>
+                <w:sz w:val="22"/>
+                <w:szCs w:val="22"/>
+              </w:rPr>
+              <w:t xml:space="preserve"> </w:t>
+            </w:r>
+          </w:p>
+        </w:tc>
+      </w:tr>
+    </w:tbl>
+    <w:p>
+      <w:pPr>
+        <w:spacing w:after="200" w:before="0" w:line="120"/>
+      </w:pPr>
+      <w:r>
+        <w:rPr>
+          <w:rFonts w:ascii="Calibri" w:cs="Calibri" w:eastAsia="Calibri" w:hAnsi="Calibri"/>
+          <w:sz w:val="8"/>
+          <w:szCs w:val="8"/>
+        </w:rPr>
+        <w:t xml:space="preserve"/>
+      </w:r>
+    </w:p>
+    <w:p>
+      <w:pPr>
+        <w:spacing w:after="80" w:before="280"/>
+      </w:pPr>
+      <w:r>
+        <w:rPr>
+          <w:rFonts w:ascii="Calibri" w:cs="Calibri" w:eastAsia="Calibri" w:hAnsi="Calibri"/>
+          <w:b/>
+          <w:bCs/>
+          <w:color w:val="1B1B1E"/>
+          <w:sz w:val="22"/>
+          <w:szCs w:val="22"/>
+        </w:rPr>
+        <w:t xml:space="preserve">What I am changing this week because of that.</w:t>
       </w:r>
     </w:p>
     <w:tbl>

</xml_diff>

<commit_message>
Checkpoint becomes a pushes-and-pulls exercise; fix a focus bug and a broken workbook build
- lesson 1.8 now asks for the frictions and the desired outcomes as two
  lists before the one-sentence version, crediting the Jobs to Be Done
  work of Bob Moesta and Clayton Christensen
- the list component was declared inside the render function, so every
  keystroke remounted the input and dropped focus. Hoisted out.
- the callout helper returns an array; one caller was not spreading it,
  which produced a corrupt .docx

Co-Authored-By: Claude Fable 5.1 <noreply@anthropic.com>
</commit_message>
<xml_diff>
--- a/public/course/transition-os-workbook.docx
+++ b/public/course/transition-os-workbook.docx
@@ -10455,7 +10455,286 @@
           <w:sz w:val="22"/>
           <w:szCs w:val="22"/>
         </w:rPr>
-        <w:t xml:space="preserve">Three things leave this module with you. Write the sentence, and Explore opens.</w:t>
+        <w:t xml:space="preserve">Two lists, then one sentence. The sentence only works if you have written the honest version first.</w:t>
+      </w:r>
+    </w:p>
+    <w:p>
+      <w:pPr>
+        <w:pStyle w:val="Heading2"/>
+        <w:spacing w:after="140" w:before="360"/>
+      </w:pPr>
+      <w:r>
+        <w:rPr>
+          <w:rFonts w:ascii="Calibri" w:cs="Calibri" w:eastAsia="Calibri" w:hAnsi="Calibri"/>
+          <w:b/>
+          <w:bCs/>
+          <w:color w:val="1B1B1E"/>
+          <w:sz w:val="24"/>
+          <w:szCs w:val="24"/>
+        </w:rPr>
+        <w:t xml:space="preserve">01  I want to leave or change my situation because…</w:t>
+      </w:r>
+    </w:p>
+    <w:p>
+      <w:pPr>
+        <w:spacing w:after="120" w:before="0"/>
+      </w:pPr>
+      <w:r>
+        <w:rPr>
+          <w:rFonts w:ascii="Calibri" w:cs="Calibri" w:eastAsia="Calibri" w:hAnsi="Calibri"/>
+          <w:color w:val="6B7280"/>
+          <w:sz w:val="20"/>
+          <w:szCs w:val="20"/>
+        </w:rPr>
+        <w:t xml:space="preserve">The frictions pushing you. Be exhaustive and unpolished. "My caseload went to 68 in October and nobody mentioned it" is more use than "workload issues".</w:t>
+      </w:r>
+    </w:p>
+    <w:p>
+      <w:pPr>
+        <w:spacing w:after="80" w:before="280"/>
+      </w:pPr>
+      <w:r>
+        <w:rPr>
+          <w:rFonts w:ascii="Calibri" w:cs="Calibri" w:eastAsia="Calibri" w:hAnsi="Calibri"/>
+          <w:b/>
+          <w:bCs/>
+          <w:color w:val="1B1B1E"/>
+          <w:sz w:val="22"/>
+          <w:szCs w:val="22"/>
+        </w:rPr>
+        <w:t xml:space="preserve">List them all. Six or eight is normal.</w:t>
+      </w:r>
+    </w:p>
+    <w:tbl>
+      <w:tblPr>
+        <w:tblW w:type="dxa" w:w="9360"/>
+        <w:tblBorders>
+          <w:top w:val="single" w:color="auto" w:sz="4"/>
+          <w:left w:val="single" w:color="auto" w:sz="4"/>
+          <w:bottom w:val="single" w:color="auto" w:sz="4"/>
+          <w:right w:val="single" w:color="auto" w:sz="4"/>
+          <w:insideH w:val="single" w:color="auto" w:sz="4"/>
+          <w:insideV w:val="single" w:color="auto" w:sz="4"/>
+        </w:tblBorders>
+      </w:tblPr>
+      <w:tblGrid>
+        <w:gridCol w:w="9360"/>
+      </w:tblGrid>
+      <w:tr>
+        <w:trPr>
+          <w:trHeight w:val="2260" w:hRule="atLeast"/>
+        </w:trPr>
+        <w:tc>
+          <w:tcPr>
+            <w:tcW w:type="dxa" w:w="9360"/>
+            <w:tcBorders>
+              <w:top w:val="single" w:color="D1D5DB" w:sz="6"/>
+              <w:left w:val="single" w:color="D1D5DB" w:sz="6"/>
+              <w:bottom w:val="single" w:color="D1D5DB" w:sz="6"/>
+              <w:right w:val="single" w:color="D1D5DB" w:sz="6"/>
+            </w:tcBorders>
+            <w:shd w:fill="FFFFFF" w:color="auto" w:val="clear"/>
+            <w:tcMar>
+              <w:top w:type="dxa" w:w="140"/>
+              <w:left w:type="dxa" w:w="160"/>
+              <w:bottom w:type="dxa" w:w="140"/>
+              <w:right w:type="dxa" w:w="160"/>
+            </w:tcMar>
+          </w:tcPr>
+          <w:p>
+            <w:pPr>
+              <w:spacing w:after="120" w:before="0"/>
+            </w:pPr>
+            <w:r>
+              <w:rPr>
+                <w:rFonts w:ascii="Calibri" w:cs="Calibri" w:eastAsia="Calibri" w:hAnsi="Calibri"/>
+                <w:color w:val="1B1B1E"/>
+                <w:sz w:val="22"/>
+                <w:szCs w:val="22"/>
+              </w:rPr>
+              <w:t xml:space="preserve"> </w:t>
+            </w:r>
+          </w:p>
+        </w:tc>
+      </w:tr>
+    </w:tbl>
+    <w:p>
+      <w:pPr>
+        <w:spacing w:after="200" w:before="0" w:line="120"/>
+      </w:pPr>
+      <w:r>
+        <w:rPr>
+          <w:rFonts w:ascii="Calibri" w:cs="Calibri" w:eastAsia="Calibri" w:hAnsi="Calibri"/>
+          <w:sz w:val="8"/>
+          <w:szCs w:val="8"/>
+        </w:rPr>
+        <w:t xml:space="preserve"/>
+      </w:r>
+    </w:p>
+    <w:p>
+      <w:pPr>
+        <w:pStyle w:val="Heading2"/>
+        <w:spacing w:after="140" w:before="360"/>
+      </w:pPr>
+      <w:r>
+        <w:rPr>
+          <w:rFonts w:ascii="Calibri" w:cs="Calibri" w:eastAsia="Calibri" w:hAnsi="Calibri"/>
+          <w:b/>
+          <w:bCs/>
+          <w:color w:val="1B1B1E"/>
+          <w:sz w:val="24"/>
+          <w:szCs w:val="24"/>
+        </w:rPr>
+        <w:t xml:space="preserve">02  I want my next chapter to give me…</w:t>
+      </w:r>
+    </w:p>
+    <w:p>
+      <w:pPr>
+        <w:spacing w:after="120" w:before="0"/>
+      </w:pPr>
+      <w:r>
+        <w:rPr>
+          <w:rFonts w:ascii="Calibri" w:cs="Calibri" w:eastAsia="Calibri" w:hAnsi="Calibri"/>
+          <w:color w:val="6B7280"/>
+          <w:sz w:val="20"/>
+          <w:szCs w:val="20"/>
+        </w:rPr>
+        <w:t xml:space="preserve">The outcomes pulling you. Concrete again: "control over when I do focused work" beats "flexibility".</w:t>
+      </w:r>
+    </w:p>
+    <w:p>
+      <w:pPr>
+        <w:spacing w:after="80" w:before="280"/>
+      </w:pPr>
+      <w:r>
+        <w:rPr>
+          <w:rFonts w:ascii="Calibri" w:cs="Calibri" w:eastAsia="Calibri" w:hAnsi="Calibri"/>
+          <w:b/>
+          <w:bCs/>
+          <w:color w:val="1B1B1E"/>
+          <w:sz w:val="22"/>
+          <w:szCs w:val="22"/>
+        </w:rPr>
+        <w:t xml:space="preserve">List them all.</w:t>
+      </w:r>
+    </w:p>
+    <w:tbl>
+      <w:tblPr>
+        <w:tblW w:type="dxa" w:w="9360"/>
+        <w:tblBorders>
+          <w:top w:val="single" w:color="auto" w:sz="4"/>
+          <w:left w:val="single" w:color="auto" w:sz="4"/>
+          <w:bottom w:val="single" w:color="auto" w:sz="4"/>
+          <w:right w:val="single" w:color="auto" w:sz="4"/>
+          <w:insideH w:val="single" w:color="auto" w:sz="4"/>
+          <w:insideV w:val="single" w:color="auto" w:sz="4"/>
+        </w:tblBorders>
+      </w:tblPr>
+      <w:tblGrid>
+        <w:gridCol w:w="9360"/>
+      </w:tblGrid>
+      <w:tr>
+        <w:trPr>
+          <w:trHeight w:val="2260" w:hRule="atLeast"/>
+        </w:trPr>
+        <w:tc>
+          <w:tcPr>
+            <w:tcW w:type="dxa" w:w="9360"/>
+            <w:tcBorders>
+              <w:top w:val="single" w:color="D1D5DB" w:sz="6"/>
+              <w:left w:val="single" w:color="D1D5DB" w:sz="6"/>
+              <w:bottom w:val="single" w:color="D1D5DB" w:sz="6"/>
+              <w:right w:val="single" w:color="D1D5DB" w:sz="6"/>
+            </w:tcBorders>
+            <w:shd w:fill="FFFFFF" w:color="auto" w:val="clear"/>
+            <w:tcMar>
+              <w:top w:type="dxa" w:w="140"/>
+              <w:left w:type="dxa" w:w="160"/>
+              <w:bottom w:type="dxa" w:w="140"/>
+              <w:right w:type="dxa" w:w="160"/>
+            </w:tcMar>
+          </w:tcPr>
+          <w:p>
+            <w:pPr>
+              <w:spacing w:after="120" w:before="0"/>
+            </w:pPr>
+            <w:r>
+              <w:rPr>
+                <w:rFonts w:ascii="Calibri" w:cs="Calibri" w:eastAsia="Calibri" w:hAnsi="Calibri"/>
+                <w:color w:val="1B1B1E"/>
+                <w:sz w:val="22"/>
+                <w:szCs w:val="22"/>
+              </w:rPr>
+              <w:t xml:space="preserve"> </w:t>
+            </w:r>
+          </w:p>
+        </w:tc>
+      </w:tr>
+    </w:tbl>
+    <w:p>
+      <w:pPr>
+        <w:spacing w:after="200" w:before="0" w:line="120"/>
+      </w:pPr>
+      <w:r>
+        <w:rPr>
+          <w:rFonts w:ascii="Calibri" w:cs="Calibri" w:eastAsia="Calibri" w:hAnsi="Calibri"/>
+          <w:sz w:val="8"/>
+          <w:szCs w:val="8"/>
+        </w:rPr>
+        <w:t xml:space="preserve"/>
+      </w:r>
+    </w:p>
+    <w:p>
+      <w:r>
+        <w:br w:type="page"/>
+      </w:r>
+    </w:p>
+    <w:p>
+      <w:pPr>
+        <w:spacing w:after="60" w:before="120"/>
+      </w:pPr>
+      <w:r>
+        <w:rPr>
+          <w:rFonts w:ascii="Calibri" w:cs="Calibri" w:eastAsia="Calibri" w:hAnsi="Calibri"/>
+          <w:b/>
+          <w:bCs/>
+          <w:color w:val="2D6A4F"/>
+          <w:spacing w:val="30"/>
+          <w:sz w:val="17"/>
+          <w:szCs w:val="17"/>
+        </w:rPr>
+        <w:t xml:space="preserve">MODULE 1 · CHECKPOINT</w:t>
+      </w:r>
+    </w:p>
+    <w:p>
+      <w:pPr>
+        <w:pStyle w:val="Heading1"/>
+        <w:spacing w:after="60" w:before="0"/>
+      </w:pPr>
+      <w:r>
+        <w:rPr>
+          <w:rFonts w:ascii="Georgia" w:cs="Georgia" w:eastAsia="Georgia" w:hAnsi="Georgia"/>
+          <w:b/>
+          <w:bCs/>
+          <w:color w:val="1B1B1E"/>
+          <w:sz w:val="40"/>
+          <w:szCs w:val="40"/>
+        </w:rPr>
+        <w:t xml:space="preserve">Your definition of progress</w:t>
+      </w:r>
+    </w:p>
+    <w:p>
+      <w:pPr>
+        <w:spacing w:after="320" w:before="0"/>
+      </w:pPr>
+      <w:r>
+        <w:rPr>
+          <w:rFonts w:ascii="Calibri" w:cs="Calibri" w:eastAsia="Calibri" w:hAnsi="Calibri"/>
+          <w:color w:val="6B7280"/>
+          <w:sz w:val="22"/>
+          <w:szCs w:val="22"/>
+        </w:rPr>
+        <w:t xml:space="preserve">Circle the two or three on each list that carry the most weight, then write them here.</w:t>
       </w:r>
     </w:p>
     <w:tbl>
@@ -10508,7 +10787,7 @@
                 <w:sz w:val="21"/>
                 <w:szCs w:val="21"/>
               </w:rPr>
-              <w:t xml:space="preserve">My stage</w:t>
+              <w:t xml:space="preserve">Moving away from, 1</w:t>
             </w:r>
           </w:p>
         </w:tc>
@@ -10579,21 +10858,7 @@
                 <w:sz w:val="21"/>
                 <w:szCs w:val="21"/>
               </w:rPr>
-              <w:t xml:space="preserve">My verdict</w:t>
-            </w:r>
-          </w:p>
-          <w:p>
-            <w:pPr>
-              <w:spacing w:after="0" w:before="0"/>
-            </w:pPr>
-            <w:r>
-              <w:rPr>
-                <w:rFonts w:ascii="Calibri" w:cs="Calibri" w:eastAsia="Calibri" w:hAnsi="Calibri"/>
-                <w:color w:val="6B7280"/>
-                <w:sz w:val="18"/>
-                <w:szCs w:val="18"/>
-              </w:rPr>
-              <w:t xml:space="preserve">Bad workplace / bad fit / bad season</w:t>
+              <w:t xml:space="preserve">Moving away from, 2</w:t>
             </w:r>
           </w:p>
         </w:tc>
@@ -10664,6 +10929,578 @@
                 <w:sz w:val="21"/>
                 <w:szCs w:val="21"/>
               </w:rPr>
+              <w:t xml:space="preserve">Moving away from, 3</w:t>
+            </w:r>
+          </w:p>
+        </w:tc>
+        <w:tc>
+          <w:tcPr>
+            <w:tcW w:type="dxa" w:w="5760"/>
+            <w:tcBorders>
+              <w:top w:val="single" w:color="D1D5DB" w:sz="6"/>
+              <w:left w:val="single" w:color="D1D5DB" w:sz="6"/>
+              <w:bottom w:val="single" w:color="D1D5DB" w:sz="6"/>
+              <w:right w:val="single" w:color="D1D5DB" w:sz="6"/>
+            </w:tcBorders>
+            <w:shd w:fill="FFFFFF" w:color="auto" w:val="clear"/>
+            <w:tcMar>
+              <w:top w:type="dxa" w:w="120"/>
+              <w:left w:type="dxa" w:w="160"/>
+              <w:bottom w:type="dxa" w:w="120"/>
+              <w:right w:type="dxa" w:w="160"/>
+            </w:tcMar>
+          </w:tcPr>
+          <w:p>
+            <w:pPr>
+              <w:spacing w:after="120" w:before="0"/>
+            </w:pPr>
+            <w:r>
+              <w:rPr>
+                <w:rFonts w:ascii="Calibri" w:cs="Calibri" w:eastAsia="Calibri" w:hAnsi="Calibri"/>
+                <w:color w:val="1B1B1E"/>
+                <w:sz w:val="22"/>
+                <w:szCs w:val="22"/>
+              </w:rPr>
+              <w:t xml:space="preserve"> </w:t>
+            </w:r>
+          </w:p>
+        </w:tc>
+      </w:tr>
+      <w:tr>
+        <w:trPr>
+          <w:trHeight w:val="640" w:hRule="atLeast"/>
+        </w:trPr>
+        <w:tc>
+          <w:tcPr>
+            <w:tcW w:type="dxa" w:w="3600"/>
+            <w:tcBorders>
+              <w:top w:val="single" w:color="D1D5DB" w:sz="6"/>
+              <w:left w:val="single" w:color="D1D5DB" w:sz="6"/>
+              <w:bottom w:val="single" w:color="D1D5DB" w:sz="6"/>
+              <w:right w:val="single" w:color="D1D5DB" w:sz="6"/>
+            </w:tcBorders>
+            <w:shd w:fill="F0FAF3" w:color="auto" w:val="clear"/>
+            <w:tcMar>
+              <w:top w:type="dxa" w:w="120"/>
+              <w:left w:type="dxa" w:w="160"/>
+              <w:bottom w:type="dxa" w:w="120"/>
+              <w:right w:type="dxa" w:w="160"/>
+            </w:tcMar>
+          </w:tcPr>
+          <w:p>
+            <w:pPr>
+              <w:spacing w:after="120" w:before="0"/>
+            </w:pPr>
+            <w:r>
+              <w:rPr>
+                <w:rFonts w:ascii="Calibri" w:cs="Calibri" w:eastAsia="Calibri" w:hAnsi="Calibri"/>
+                <w:b/>
+                <w:bCs/>
+                <w:color w:val="1B1B1E"/>
+                <w:sz w:val="21"/>
+                <w:szCs w:val="21"/>
+              </w:rPr>
+              <w:t xml:space="preserve">Moving toward, 1</w:t>
+            </w:r>
+          </w:p>
+        </w:tc>
+        <w:tc>
+          <w:tcPr>
+            <w:tcW w:type="dxa" w:w="5760"/>
+            <w:tcBorders>
+              <w:top w:val="single" w:color="D1D5DB" w:sz="6"/>
+              <w:left w:val="single" w:color="D1D5DB" w:sz="6"/>
+              <w:bottom w:val="single" w:color="D1D5DB" w:sz="6"/>
+              <w:right w:val="single" w:color="D1D5DB" w:sz="6"/>
+            </w:tcBorders>
+            <w:shd w:fill="FFFFFF" w:color="auto" w:val="clear"/>
+            <w:tcMar>
+              <w:top w:type="dxa" w:w="120"/>
+              <w:left w:type="dxa" w:w="160"/>
+              <w:bottom w:type="dxa" w:w="120"/>
+              <w:right w:type="dxa" w:w="160"/>
+            </w:tcMar>
+          </w:tcPr>
+          <w:p>
+            <w:pPr>
+              <w:spacing w:after="120" w:before="0"/>
+            </w:pPr>
+            <w:r>
+              <w:rPr>
+                <w:rFonts w:ascii="Calibri" w:cs="Calibri" w:eastAsia="Calibri" w:hAnsi="Calibri"/>
+                <w:color w:val="1B1B1E"/>
+                <w:sz w:val="22"/>
+                <w:szCs w:val="22"/>
+              </w:rPr>
+              <w:t xml:space="preserve"> </w:t>
+            </w:r>
+          </w:p>
+        </w:tc>
+      </w:tr>
+      <w:tr>
+        <w:trPr>
+          <w:trHeight w:val="640" w:hRule="atLeast"/>
+        </w:trPr>
+        <w:tc>
+          <w:tcPr>
+            <w:tcW w:type="dxa" w:w="3600"/>
+            <w:tcBorders>
+              <w:top w:val="single" w:color="D1D5DB" w:sz="6"/>
+              <w:left w:val="single" w:color="D1D5DB" w:sz="6"/>
+              <w:bottom w:val="single" w:color="D1D5DB" w:sz="6"/>
+              <w:right w:val="single" w:color="D1D5DB" w:sz="6"/>
+            </w:tcBorders>
+            <w:shd w:fill="F0FAF3" w:color="auto" w:val="clear"/>
+            <w:tcMar>
+              <w:top w:type="dxa" w:w="120"/>
+              <w:left w:type="dxa" w:w="160"/>
+              <w:bottom w:type="dxa" w:w="120"/>
+              <w:right w:type="dxa" w:w="160"/>
+            </w:tcMar>
+          </w:tcPr>
+          <w:p>
+            <w:pPr>
+              <w:spacing w:after="120" w:before="0"/>
+            </w:pPr>
+            <w:r>
+              <w:rPr>
+                <w:rFonts w:ascii="Calibri" w:cs="Calibri" w:eastAsia="Calibri" w:hAnsi="Calibri"/>
+                <w:b/>
+                <w:bCs/>
+                <w:color w:val="1B1B1E"/>
+                <w:sz w:val="21"/>
+                <w:szCs w:val="21"/>
+              </w:rPr>
+              <w:t xml:space="preserve">Moving toward, 2</w:t>
+            </w:r>
+          </w:p>
+        </w:tc>
+        <w:tc>
+          <w:tcPr>
+            <w:tcW w:type="dxa" w:w="5760"/>
+            <w:tcBorders>
+              <w:top w:val="single" w:color="D1D5DB" w:sz="6"/>
+              <w:left w:val="single" w:color="D1D5DB" w:sz="6"/>
+              <w:bottom w:val="single" w:color="D1D5DB" w:sz="6"/>
+              <w:right w:val="single" w:color="D1D5DB" w:sz="6"/>
+            </w:tcBorders>
+            <w:shd w:fill="FFFFFF" w:color="auto" w:val="clear"/>
+            <w:tcMar>
+              <w:top w:type="dxa" w:w="120"/>
+              <w:left w:type="dxa" w:w="160"/>
+              <w:bottom w:type="dxa" w:w="120"/>
+              <w:right w:type="dxa" w:w="160"/>
+            </w:tcMar>
+          </w:tcPr>
+          <w:p>
+            <w:pPr>
+              <w:spacing w:after="120" w:before="0"/>
+            </w:pPr>
+            <w:r>
+              <w:rPr>
+                <w:rFonts w:ascii="Calibri" w:cs="Calibri" w:eastAsia="Calibri" w:hAnsi="Calibri"/>
+                <w:color w:val="1B1B1E"/>
+                <w:sz w:val="22"/>
+                <w:szCs w:val="22"/>
+              </w:rPr>
+              <w:t xml:space="preserve"> </w:t>
+            </w:r>
+          </w:p>
+        </w:tc>
+      </w:tr>
+      <w:tr>
+        <w:trPr>
+          <w:trHeight w:val="640" w:hRule="atLeast"/>
+        </w:trPr>
+        <w:tc>
+          <w:tcPr>
+            <w:tcW w:type="dxa" w:w="3600"/>
+            <w:tcBorders>
+              <w:top w:val="single" w:color="D1D5DB" w:sz="6"/>
+              <w:left w:val="single" w:color="D1D5DB" w:sz="6"/>
+              <w:bottom w:val="single" w:color="D1D5DB" w:sz="6"/>
+              <w:right w:val="single" w:color="D1D5DB" w:sz="6"/>
+            </w:tcBorders>
+            <w:shd w:fill="F0FAF3" w:color="auto" w:val="clear"/>
+            <w:tcMar>
+              <w:top w:type="dxa" w:w="120"/>
+              <w:left w:type="dxa" w:w="160"/>
+              <w:bottom w:type="dxa" w:w="120"/>
+              <w:right w:type="dxa" w:w="160"/>
+            </w:tcMar>
+          </w:tcPr>
+          <w:p>
+            <w:pPr>
+              <w:spacing w:after="120" w:before="0"/>
+            </w:pPr>
+            <w:r>
+              <w:rPr>
+                <w:rFonts w:ascii="Calibri" w:cs="Calibri" w:eastAsia="Calibri" w:hAnsi="Calibri"/>
+                <w:b/>
+                <w:bCs/>
+                <w:color w:val="1B1B1E"/>
+                <w:sz w:val="21"/>
+                <w:szCs w:val="21"/>
+              </w:rPr>
+              <w:t xml:space="preserve">Moving toward, 3</w:t>
+            </w:r>
+          </w:p>
+        </w:tc>
+        <w:tc>
+          <w:tcPr>
+            <w:tcW w:type="dxa" w:w="5760"/>
+            <w:tcBorders>
+              <w:top w:val="single" w:color="D1D5DB" w:sz="6"/>
+              <w:left w:val="single" w:color="D1D5DB" w:sz="6"/>
+              <w:bottom w:val="single" w:color="D1D5DB" w:sz="6"/>
+              <w:right w:val="single" w:color="D1D5DB" w:sz="6"/>
+            </w:tcBorders>
+            <w:shd w:fill="FFFFFF" w:color="auto" w:val="clear"/>
+            <w:tcMar>
+              <w:top w:type="dxa" w:w="120"/>
+              <w:left w:type="dxa" w:w="160"/>
+              <w:bottom w:type="dxa" w:w="120"/>
+              <w:right w:type="dxa" w:w="160"/>
+            </w:tcMar>
+          </w:tcPr>
+          <w:p>
+            <w:pPr>
+              <w:spacing w:after="120" w:before="0"/>
+            </w:pPr>
+            <w:r>
+              <w:rPr>
+                <w:rFonts w:ascii="Calibri" w:cs="Calibri" w:eastAsia="Calibri" w:hAnsi="Calibri"/>
+                <w:color w:val="1B1B1E"/>
+                <w:sz w:val="22"/>
+                <w:szCs w:val="22"/>
+              </w:rPr>
+              <w:t xml:space="preserve"> </w:t>
+            </w:r>
+          </w:p>
+        </w:tc>
+      </w:tr>
+    </w:tbl>
+    <w:p>
+      <w:pPr>
+        <w:spacing w:after="200" w:before="0" w:line="120"/>
+      </w:pPr>
+      <w:r>
+        <w:rPr>
+          <w:rFonts w:ascii="Calibri" w:cs="Calibri" w:eastAsia="Calibri" w:hAnsi="Calibri"/>
+          <w:sz w:val="8"/>
+          <w:szCs w:val="8"/>
+        </w:rPr>
+        <w:t xml:space="preserve"/>
+      </w:r>
+    </w:p>
+    <w:p>
+      <w:pPr>
+        <w:spacing w:after="120" w:before="0"/>
+      </w:pPr>
+      <w:r>
+        <w:rPr>
+          <w:rFonts w:ascii="Calibri" w:cs="Calibri" w:eastAsia="Calibri" w:hAnsi="Calibri"/>
+          <w:color w:val="6B7280"/>
+          <w:sz w:val="20"/>
+          <w:szCs w:val="20"/>
+        </w:rPr>
+        <w:t xml:space="preserve">Two people can write the same push and need opposite things. That is why the sentence below is yours rather than a category. The pushes-and-pulls framing comes from the Jobs to Be Done work of Bob Moesta and Clayton Christensen.</w:t>
+      </w:r>
+    </w:p>
+    <w:p>
+      <w:pPr>
+        <w:pStyle w:val="Heading2"/>
+        <w:spacing w:after="140" w:before="360"/>
+      </w:pPr>
+      <w:r>
+        <w:rPr>
+          <w:rFonts w:ascii="Calibri" w:cs="Calibri" w:eastAsia="Calibri" w:hAnsi="Calibri"/>
+          <w:b/>
+          <w:bCs/>
+          <w:color w:val="1B1B1E"/>
+          <w:sz w:val="24"/>
+          <w:szCs w:val="24"/>
+        </w:rPr>
+        <w:t xml:space="preserve">Where I landed this week</w:t>
+      </w:r>
+    </w:p>
+    <w:tbl>
+      <w:tblPr>
+        <w:tblW w:type="dxa" w:w="9360"/>
+        <w:tblBorders>
+          <w:top w:val="single" w:color="auto" w:sz="4"/>
+          <w:left w:val="single" w:color="auto" w:sz="4"/>
+          <w:bottom w:val="single" w:color="auto" w:sz="4"/>
+          <w:right w:val="single" w:color="auto" w:sz="4"/>
+          <w:insideH w:val="single" w:color="auto" w:sz="4"/>
+          <w:insideV w:val="single" w:color="auto" w:sz="4"/>
+        </w:tblBorders>
+      </w:tblPr>
+      <w:tblGrid>
+        <w:gridCol w:w="3600"/>
+        <w:gridCol w:w="5760"/>
+      </w:tblGrid>
+      <w:tr>
+        <w:trPr>
+          <w:trHeight w:val="640" w:hRule="atLeast"/>
+        </w:trPr>
+        <w:tc>
+          <w:tcPr>
+            <w:tcW w:type="dxa" w:w="3600"/>
+            <w:tcBorders>
+              <w:top w:val="single" w:color="D1D5DB" w:sz="6"/>
+              <w:left w:val="single" w:color="D1D5DB" w:sz="6"/>
+              <w:bottom w:val="single" w:color="D1D5DB" w:sz="6"/>
+              <w:right w:val="single" w:color="D1D5DB" w:sz="6"/>
+            </w:tcBorders>
+            <w:shd w:fill="F0FAF3" w:color="auto" w:val="clear"/>
+            <w:tcMar>
+              <w:top w:type="dxa" w:w="120"/>
+              <w:left w:type="dxa" w:w="160"/>
+              <w:bottom w:type="dxa" w:w="120"/>
+              <w:right w:type="dxa" w:w="160"/>
+            </w:tcMar>
+          </w:tcPr>
+          <w:p>
+            <w:pPr>
+              <w:spacing w:after="120" w:before="0"/>
+            </w:pPr>
+            <w:r>
+              <w:rPr>
+                <w:rFonts w:ascii="Calibri" w:cs="Calibri" w:eastAsia="Calibri" w:hAnsi="Calibri"/>
+                <w:b/>
+                <w:bCs/>
+                <w:color w:val="1B1B1E"/>
+                <w:sz w:val="21"/>
+                <w:szCs w:val="21"/>
+              </w:rPr>
+              <w:t xml:space="preserve">My stage</w:t>
+            </w:r>
+          </w:p>
+        </w:tc>
+        <w:tc>
+          <w:tcPr>
+            <w:tcW w:type="dxa" w:w="5760"/>
+            <w:tcBorders>
+              <w:top w:val="single" w:color="D1D5DB" w:sz="6"/>
+              <w:left w:val="single" w:color="D1D5DB" w:sz="6"/>
+              <w:bottom w:val="single" w:color="D1D5DB" w:sz="6"/>
+              <w:right w:val="single" w:color="D1D5DB" w:sz="6"/>
+            </w:tcBorders>
+            <w:shd w:fill="FFFFFF" w:color="auto" w:val="clear"/>
+            <w:tcMar>
+              <w:top w:type="dxa" w:w="120"/>
+              <w:left w:type="dxa" w:w="160"/>
+              <w:bottom w:type="dxa" w:w="120"/>
+              <w:right w:type="dxa" w:w="160"/>
+            </w:tcMar>
+          </w:tcPr>
+          <w:p>
+            <w:pPr>
+              <w:spacing w:after="120" w:before="0"/>
+            </w:pPr>
+            <w:r>
+              <w:rPr>
+                <w:rFonts w:ascii="Calibri" w:cs="Calibri" w:eastAsia="Calibri" w:hAnsi="Calibri"/>
+                <w:color w:val="1B1B1E"/>
+                <w:sz w:val="22"/>
+                <w:szCs w:val="22"/>
+              </w:rPr>
+              <w:t xml:space="preserve"> </w:t>
+            </w:r>
+          </w:p>
+        </w:tc>
+      </w:tr>
+      <w:tr>
+        <w:trPr>
+          <w:trHeight w:val="640" w:hRule="atLeast"/>
+        </w:trPr>
+        <w:tc>
+          <w:tcPr>
+            <w:tcW w:type="dxa" w:w="3600"/>
+            <w:tcBorders>
+              <w:top w:val="single" w:color="D1D5DB" w:sz="6"/>
+              <w:left w:val="single" w:color="D1D5DB" w:sz="6"/>
+              <w:bottom w:val="single" w:color="D1D5DB" w:sz="6"/>
+              <w:right w:val="single" w:color="D1D5DB" w:sz="6"/>
+            </w:tcBorders>
+            <w:shd w:fill="F0FAF3" w:color="auto" w:val="clear"/>
+            <w:tcMar>
+              <w:top w:type="dxa" w:w="120"/>
+              <w:left w:type="dxa" w:w="160"/>
+              <w:bottom w:type="dxa" w:w="120"/>
+              <w:right w:type="dxa" w:w="160"/>
+            </w:tcMar>
+          </w:tcPr>
+          <w:p>
+            <w:pPr>
+              <w:spacing w:after="120" w:before="0"/>
+            </w:pPr>
+            <w:r>
+              <w:rPr>
+                <w:rFonts w:ascii="Calibri" w:cs="Calibri" w:eastAsia="Calibri" w:hAnsi="Calibri"/>
+                <w:b/>
+                <w:bCs/>
+                <w:color w:val="1B1B1E"/>
+                <w:sz w:val="21"/>
+                <w:szCs w:val="21"/>
+              </w:rPr>
+              <w:t xml:space="preserve">My verdict</w:t>
+            </w:r>
+          </w:p>
+          <w:p>
+            <w:pPr>
+              <w:spacing w:after="0" w:before="0"/>
+            </w:pPr>
+            <w:r>
+              <w:rPr>
+                <w:rFonts w:ascii="Calibri" w:cs="Calibri" w:eastAsia="Calibri" w:hAnsi="Calibri"/>
+                <w:color w:val="6B7280"/>
+                <w:sz w:val="18"/>
+                <w:szCs w:val="18"/>
+              </w:rPr>
+              <w:t xml:space="preserve">Bad workplace / bad fit / bad season</w:t>
+            </w:r>
+          </w:p>
+        </w:tc>
+        <w:tc>
+          <w:tcPr>
+            <w:tcW w:type="dxa" w:w="5760"/>
+            <w:tcBorders>
+              <w:top w:val="single" w:color="D1D5DB" w:sz="6"/>
+              <w:left w:val="single" w:color="D1D5DB" w:sz="6"/>
+              <w:bottom w:val="single" w:color="D1D5DB" w:sz="6"/>
+              <w:right w:val="single" w:color="D1D5DB" w:sz="6"/>
+            </w:tcBorders>
+            <w:shd w:fill="FFFFFF" w:color="auto" w:val="clear"/>
+            <w:tcMar>
+              <w:top w:type="dxa" w:w="120"/>
+              <w:left w:type="dxa" w:w="160"/>
+              <w:bottom w:type="dxa" w:w="120"/>
+              <w:right w:type="dxa" w:w="160"/>
+            </w:tcMar>
+          </w:tcPr>
+          <w:p>
+            <w:pPr>
+              <w:spacing w:after="120" w:before="0"/>
+            </w:pPr>
+            <w:r>
+              <w:rPr>
+                <w:rFonts w:ascii="Calibri" w:cs="Calibri" w:eastAsia="Calibri" w:hAnsi="Calibri"/>
+                <w:color w:val="1B1B1E"/>
+                <w:sz w:val="22"/>
+                <w:szCs w:val="22"/>
+              </w:rPr>
+              <w:t xml:space="preserve"> </w:t>
+            </w:r>
+          </w:p>
+        </w:tc>
+      </w:tr>
+      <w:tr>
+        <w:trPr>
+          <w:trHeight w:val="640" w:hRule="atLeast"/>
+        </w:trPr>
+        <w:tc>
+          <w:tcPr>
+            <w:tcW w:type="dxa" w:w="3600"/>
+            <w:tcBorders>
+              <w:top w:val="single" w:color="D1D5DB" w:sz="6"/>
+              <w:left w:val="single" w:color="D1D5DB" w:sz="6"/>
+              <w:bottom w:val="single" w:color="D1D5DB" w:sz="6"/>
+              <w:right w:val="single" w:color="D1D5DB" w:sz="6"/>
+            </w:tcBorders>
+            <w:shd w:fill="F0FAF3" w:color="auto" w:val="clear"/>
+            <w:tcMar>
+              <w:top w:type="dxa" w:w="120"/>
+              <w:left w:type="dxa" w:w="160"/>
+              <w:bottom w:type="dxa" w:w="120"/>
+              <w:right w:type="dxa" w:w="160"/>
+            </w:tcMar>
+          </w:tcPr>
+          <w:p>
+            <w:pPr>
+              <w:spacing w:after="120" w:before="0"/>
+            </w:pPr>
+            <w:r>
+              <w:rPr>
+                <w:rFonts w:ascii="Calibri" w:cs="Calibri" w:eastAsia="Calibri" w:hAnsi="Calibri"/>
+                <w:b/>
+                <w:bCs/>
+                <w:color w:val="1B1B1E"/>
+                <w:sz w:val="21"/>
+                <w:szCs w:val="21"/>
+              </w:rPr>
+              <w:t xml:space="preserve">What gave me energy, in a phrase</w:t>
+            </w:r>
+          </w:p>
+        </w:tc>
+        <w:tc>
+          <w:tcPr>
+            <w:tcW w:type="dxa" w:w="5760"/>
+            <w:tcBorders>
+              <w:top w:val="single" w:color="D1D5DB" w:sz="6"/>
+              <w:left w:val="single" w:color="D1D5DB" w:sz="6"/>
+              <w:bottom w:val="single" w:color="D1D5DB" w:sz="6"/>
+              <w:right w:val="single" w:color="D1D5DB" w:sz="6"/>
+            </w:tcBorders>
+            <w:shd w:fill="FFFFFF" w:color="auto" w:val="clear"/>
+            <w:tcMar>
+              <w:top w:type="dxa" w:w="120"/>
+              <w:left w:type="dxa" w:w="160"/>
+              <w:bottom w:type="dxa" w:w="120"/>
+              <w:right w:type="dxa" w:w="160"/>
+            </w:tcMar>
+          </w:tcPr>
+          <w:p>
+            <w:pPr>
+              <w:spacing w:after="120" w:before="0"/>
+            </w:pPr>
+            <w:r>
+              <w:rPr>
+                <w:rFonts w:ascii="Calibri" w:cs="Calibri" w:eastAsia="Calibri" w:hAnsi="Calibri"/>
+                <w:color w:val="1B1B1E"/>
+                <w:sz w:val="22"/>
+                <w:szCs w:val="22"/>
+              </w:rPr>
+              <w:t xml:space="preserve"> </w:t>
+            </w:r>
+          </w:p>
+        </w:tc>
+      </w:tr>
+      <w:tr>
+        <w:trPr>
+          <w:trHeight w:val="640" w:hRule="atLeast"/>
+        </w:trPr>
+        <w:tc>
+          <w:tcPr>
+            <w:tcW w:type="dxa" w:w="3600"/>
+            <w:tcBorders>
+              <w:top w:val="single" w:color="D1D5DB" w:sz="6"/>
+              <w:left w:val="single" w:color="D1D5DB" w:sz="6"/>
+              <w:bottom w:val="single" w:color="D1D5DB" w:sz="6"/>
+              <w:right w:val="single" w:color="D1D5DB" w:sz="6"/>
+            </w:tcBorders>
+            <w:shd w:fill="F0FAF3" w:color="auto" w:val="clear"/>
+            <w:tcMar>
+              <w:top w:type="dxa" w:w="120"/>
+              <w:left w:type="dxa" w:w="160"/>
+              <w:bottom w:type="dxa" w:w="120"/>
+              <w:right w:type="dxa" w:w="160"/>
+            </w:tcMar>
+          </w:tcPr>
+          <w:p>
+            <w:pPr>
+              <w:spacing w:after="120" w:before="0"/>
+            </w:pPr>
+            <w:r>
+              <w:rPr>
+                <w:rFonts w:ascii="Calibri" w:cs="Calibri" w:eastAsia="Calibri" w:hAnsi="Calibri"/>
+                <w:b/>
+                <w:bCs/>
+                <w:color w:val="1B1B1E"/>
+                <w:sz w:val="21"/>
+                <w:szCs w:val="21"/>
+              </w:rPr>
               <w:t xml:space="preserve">The three paths my dials pointed at</w:t>
             </w:r>
           </w:p>
@@ -10728,7 +11565,7 @@
           <w:sz w:val="22"/>
           <w:szCs w:val="22"/>
         </w:rPr>
-        <w:t xml:space="preserve">Why I'm leaving, in pull language. One sentence about where you're going, not what you're escaping. No burnout words.</w:t>
+        <w:t xml:space="preserve">In one sentence, the progress I am looking for is… Where you are going, not what you are escaping. No burnout words.</w:t>
       </w:r>
     </w:p>
     <w:p>
@@ -10870,7 +11707,7 @@
                 <w:sz w:val="22"/>
                 <w:szCs w:val="22"/>
               </w:rPr>
-              <w:t xml:space="preserve">“Examples of pull: "I want to work at the scale of a system instead of one room." "I want to build the training instead of deliver it." "I want to use what I know about clinicians to make a product they'll actually use."”</w:t>
+              <w:t xml:space="preserve">“Examples of pull: "I want to work at the scale of a system instead of one room." "I want to build the training instead of deliver it." "I want to use what I know about clinicians to make a product they will actually use."”</w:t>
             </w:r>
           </w:p>
         </w:tc>
@@ -10902,7 +11739,7 @@
           <w:sz w:val="22"/>
           <w:szCs w:val="22"/>
         </w:rPr>
-        <w:t xml:space="preserve">Read it aloud. Would a hiring manager hear a retention risk, or a plan? Rewrite once if it's the first.</w:t>
+        <w:t xml:space="preserve">Read it aloud. Would a hiring manager hear a retention risk, or a plan? Rewrite once if it is the first.</w:t>
       </w:r>
     </w:p>
     <w:tbl>

</xml_diff>

<commit_message>
Divider pages earn their sheet
Each module divider was 70% white space. It now carries what you will
have at the end of that module, plus started-on and finished-on date
lines, which is the kind of thing a printed workbook should hold.

Also built scripts-free tooling in the scratchpad to render the real
.docx to paginated HTML from its own XML, since this Mac has no
LibreOffice, no Word and no Homebrew, and Pages refuses scripted export.
The dividers and the cover progress strip are now visually confirmed
rather than inferred from the OOXML.
</commit_message>
<xml_diff>
--- a/public/course/transition-os-workbook.docx
+++ b/public/course/transition-os-workbook.docx
@@ -4422,6 +4422,171 @@
       </w:r>
     </w:p>
     <w:p>
+      <w:pPr>
+        <w:spacing w:after="360"/>
+      </w:pPr>
+      <w:r>
+        <w:rPr>
+          <w:rFonts w:ascii="Calibri" w:cs="Calibri" w:eastAsia="Calibri" w:hAnsi="Calibri"/>
+          <w:color w:val="1B1B1E"/>
+          <w:sz w:val="22"/>
+          <w:szCs w:val="22"/>
+        </w:rPr>
+        <w:t xml:space="preserve"> </w:t>
+      </w:r>
+    </w:p>
+    <w:p>
+      <w:pPr>
+        <w:spacing w:after="60" w:before="120"/>
+      </w:pPr>
+      <w:r>
+        <w:rPr>
+          <w:rFonts w:ascii="Calibri" w:cs="Calibri" w:eastAsia="Calibri" w:hAnsi="Calibri"/>
+          <w:b/>
+          <w:bCs/>
+          <w:color w:val="2D6A4F"/>
+          <w:spacing w:val="30"/>
+          <w:sz w:val="17"/>
+          <w:szCs w:val="17"/>
+        </w:rPr>
+        <w:t xml:space="preserve">WHAT YOU WILL HAVE AT THE END</w:t>
+      </w:r>
+    </w:p>
+    <w:p>
+      <w:pPr>
+        <w:spacing w:after="320" w:before="0"/>
+      </w:pPr>
+      <w:r>
+        <w:rPr>
+          <w:rFonts w:ascii="Calibri" w:cs="Calibri" w:eastAsia="Calibri" w:hAnsi="Calibri"/>
+          <w:color w:val="1B1B1E"/>
+          <w:sz w:val="22"/>
+          <w:szCs w:val="22"/>
+        </w:rPr>
+        <w:t xml:space="preserve">A verdict in one word, and one sentence about where you are going that you did not have in week one.</w:t>
+      </w:r>
+    </w:p>
+    <w:tbl>
+      <w:tblPr>
+        <w:tblW w:type="dxa" w:w="9360"/>
+        <w:tblBorders>
+          <w:top w:val="single" w:color="auto" w:sz="4"/>
+          <w:left w:val="single" w:color="auto" w:sz="4"/>
+          <w:bottom w:val="single" w:color="auto" w:sz="4"/>
+          <w:right w:val="single" w:color="auto" w:sz="4"/>
+          <w:insideH w:val="single" w:color="auto" w:sz="4"/>
+          <w:insideV w:val="single" w:color="auto" w:sz="4"/>
+        </w:tblBorders>
+      </w:tblPr>
+      <w:tblGrid>
+        <w:gridCol w:w="4680"/>
+        <w:gridCol w:w="4680"/>
+      </w:tblGrid>
+      <w:tr>
+        <w:trPr>
+          <w:trHeight w:val="520" w:hRule="atLeast"/>
+        </w:trPr>
+        <w:tc>
+          <w:tcPr>
+            <w:tcW w:type="dxa" w:w="4680"/>
+            <w:tcBorders>
+              <w:top w:val="none"/>
+              <w:left w:val="none"/>
+              <w:bottom w:val="none"/>
+              <w:right w:val="none"/>
+            </w:tcBorders>
+            <w:shd w:fill="FFFFFF" w:color="auto" w:val="clear"/>
+            <w:tcMar>
+              <w:top w:type="dxa" w:w="140"/>
+              <w:left w:type="dxa" w:w="200"/>
+              <w:bottom w:type="dxa" w:w="140"/>
+              <w:right w:type="dxa" w:w="200"/>
+            </w:tcMar>
+            <w:vAlign w:val="center"/>
+          </w:tcPr>
+          <w:p>
+            <w:pPr>
+              <w:spacing w:after="60" w:before="0"/>
+            </w:pPr>
+            <w:r>
+              <w:rPr>
+                <w:rFonts w:ascii="Calibri" w:cs="Calibri" w:eastAsia="Calibri" w:hAnsi="Calibri"/>
+                <w:b/>
+                <w:bCs/>
+                <w:color w:val="1B1B1E"/>
+                <w:sz w:val="20"/>
+                <w:szCs w:val="20"/>
+              </w:rPr>
+              <w:t xml:space="preserve">Started this module on</w:t>
+            </w:r>
+          </w:p>
+          <w:p>
+            <w:pPr>
+              <w:spacing w:after="120" w:before="0"/>
+            </w:pPr>
+            <w:r>
+              <w:rPr>
+                <w:rFonts w:ascii="Calibri" w:cs="Calibri" w:eastAsia="Calibri" w:hAnsi="Calibri"/>
+                <w:color w:val="D1D5DB"/>
+                <w:sz w:val="22"/>
+                <w:szCs w:val="22"/>
+              </w:rPr>
+              <w:t xml:space="preserve">______________________</w:t>
+            </w:r>
+          </w:p>
+        </w:tc>
+        <w:tc>
+          <w:tcPr>
+            <w:tcW w:type="dxa" w:w="4680"/>
+            <w:tcBorders>
+              <w:top w:val="none"/>
+              <w:left w:val="none"/>
+              <w:bottom w:val="none"/>
+              <w:right w:val="none"/>
+            </w:tcBorders>
+            <w:shd w:fill="FFFFFF" w:color="auto" w:val="clear"/>
+            <w:tcMar>
+              <w:top w:type="dxa" w:w="140"/>
+              <w:left w:type="dxa" w:w="200"/>
+              <w:bottom w:type="dxa" w:w="140"/>
+              <w:right w:type="dxa" w:w="200"/>
+            </w:tcMar>
+            <w:vAlign w:val="center"/>
+          </w:tcPr>
+          <w:p>
+            <w:pPr>
+              <w:spacing w:after="60" w:before="0"/>
+            </w:pPr>
+            <w:r>
+              <w:rPr>
+                <w:rFonts w:ascii="Calibri" w:cs="Calibri" w:eastAsia="Calibri" w:hAnsi="Calibri"/>
+                <w:b/>
+                <w:bCs/>
+                <w:color w:val="1B1B1E"/>
+                <w:sz w:val="20"/>
+                <w:szCs w:val="20"/>
+              </w:rPr>
+              <w:t xml:space="preserve">Finished on</w:t>
+            </w:r>
+          </w:p>
+          <w:p>
+            <w:pPr>
+              <w:spacing w:after="120" w:before="0"/>
+            </w:pPr>
+            <w:r>
+              <w:rPr>
+                <w:rFonts w:ascii="Calibri" w:cs="Calibri" w:eastAsia="Calibri" w:hAnsi="Calibri"/>
+                <w:color w:val="D1D5DB"/>
+                <w:sz w:val="22"/>
+                <w:szCs w:val="22"/>
+              </w:rPr>
+              <w:t xml:space="preserve">______________________</w:t>
+            </w:r>
+          </w:p>
+        </w:tc>
+      </w:tr>
+    </w:tbl>
+    <w:p>
       <w:r>
         <w:br w:type="page"/>
       </w:r>
@@ -13225,6 +13390,171 @@
       </w:r>
     </w:p>
     <w:p>
+      <w:pPr>
+        <w:spacing w:after="360"/>
+      </w:pPr>
+      <w:r>
+        <w:rPr>
+          <w:rFonts w:ascii="Calibri" w:cs="Calibri" w:eastAsia="Calibri" w:hAnsi="Calibri"/>
+          <w:color w:val="1B1B1E"/>
+          <w:sz w:val="22"/>
+          <w:szCs w:val="22"/>
+        </w:rPr>
+        <w:t xml:space="preserve"> </w:t>
+      </w:r>
+    </w:p>
+    <w:p>
+      <w:pPr>
+        <w:spacing w:after="60" w:before="120"/>
+      </w:pPr>
+      <w:r>
+        <w:rPr>
+          <w:rFonts w:ascii="Calibri" w:cs="Calibri" w:eastAsia="Calibri" w:hAnsi="Calibri"/>
+          <w:b/>
+          <w:bCs/>
+          <w:color w:val="1E40AF"/>
+          <w:spacing w:val="30"/>
+          <w:sz w:val="17"/>
+          <w:szCs w:val="17"/>
+        </w:rPr>
+        <w:t xml:space="preserve">WHAT YOU WILL HAVE AT THE END</w:t>
+      </w:r>
+    </w:p>
+    <w:p>
+      <w:pPr>
+        <w:spacing w:after="320" w:before="0"/>
+      </w:pPr>
+      <w:r>
+        <w:rPr>
+          <w:rFonts w:ascii="Calibri" w:cs="Calibri" w:eastAsia="Calibri" w:hAnsi="Calibri"/>
+          <w:color w:val="1B1B1E"/>
+          <w:sz w:val="22"/>
+          <w:szCs w:val="22"/>
+        </w:rPr>
+        <w:t xml:space="preserve">Two or three paths you can describe out loud, and one you are curious enough to test first.</w:t>
+      </w:r>
+    </w:p>
+    <w:tbl>
+      <w:tblPr>
+        <w:tblW w:type="dxa" w:w="9360"/>
+        <w:tblBorders>
+          <w:top w:val="single" w:color="auto" w:sz="4"/>
+          <w:left w:val="single" w:color="auto" w:sz="4"/>
+          <w:bottom w:val="single" w:color="auto" w:sz="4"/>
+          <w:right w:val="single" w:color="auto" w:sz="4"/>
+          <w:insideH w:val="single" w:color="auto" w:sz="4"/>
+          <w:insideV w:val="single" w:color="auto" w:sz="4"/>
+        </w:tblBorders>
+      </w:tblPr>
+      <w:tblGrid>
+        <w:gridCol w:w="4680"/>
+        <w:gridCol w:w="4680"/>
+      </w:tblGrid>
+      <w:tr>
+        <w:trPr>
+          <w:trHeight w:val="520" w:hRule="atLeast"/>
+        </w:trPr>
+        <w:tc>
+          <w:tcPr>
+            <w:tcW w:type="dxa" w:w="4680"/>
+            <w:tcBorders>
+              <w:top w:val="none"/>
+              <w:left w:val="none"/>
+              <w:bottom w:val="none"/>
+              <w:right w:val="none"/>
+            </w:tcBorders>
+            <w:shd w:fill="FFFFFF" w:color="auto" w:val="clear"/>
+            <w:tcMar>
+              <w:top w:type="dxa" w:w="140"/>
+              <w:left w:type="dxa" w:w="200"/>
+              <w:bottom w:type="dxa" w:w="140"/>
+              <w:right w:type="dxa" w:w="200"/>
+            </w:tcMar>
+            <w:vAlign w:val="center"/>
+          </w:tcPr>
+          <w:p>
+            <w:pPr>
+              <w:spacing w:after="60" w:before="0"/>
+            </w:pPr>
+            <w:r>
+              <w:rPr>
+                <w:rFonts w:ascii="Calibri" w:cs="Calibri" w:eastAsia="Calibri" w:hAnsi="Calibri"/>
+                <w:b/>
+                <w:bCs/>
+                <w:color w:val="1B1B1E"/>
+                <w:sz w:val="20"/>
+                <w:szCs w:val="20"/>
+              </w:rPr>
+              <w:t xml:space="preserve">Started this module on</w:t>
+            </w:r>
+          </w:p>
+          <w:p>
+            <w:pPr>
+              <w:spacing w:after="120" w:before="0"/>
+            </w:pPr>
+            <w:r>
+              <w:rPr>
+                <w:rFonts w:ascii="Calibri" w:cs="Calibri" w:eastAsia="Calibri" w:hAnsi="Calibri"/>
+                <w:color w:val="D1D5DB"/>
+                <w:sz w:val="22"/>
+                <w:szCs w:val="22"/>
+              </w:rPr>
+              <w:t xml:space="preserve">______________________</w:t>
+            </w:r>
+          </w:p>
+        </w:tc>
+        <w:tc>
+          <w:tcPr>
+            <w:tcW w:type="dxa" w:w="4680"/>
+            <w:tcBorders>
+              <w:top w:val="none"/>
+              <w:left w:val="none"/>
+              <w:bottom w:val="none"/>
+              <w:right w:val="none"/>
+            </w:tcBorders>
+            <w:shd w:fill="FFFFFF" w:color="auto" w:val="clear"/>
+            <w:tcMar>
+              <w:top w:type="dxa" w:w="140"/>
+              <w:left w:type="dxa" w:w="200"/>
+              <w:bottom w:type="dxa" w:w="140"/>
+              <w:right w:type="dxa" w:w="200"/>
+            </w:tcMar>
+            <w:vAlign w:val="center"/>
+          </w:tcPr>
+          <w:p>
+            <w:pPr>
+              <w:spacing w:after="60" w:before="0"/>
+            </w:pPr>
+            <w:r>
+              <w:rPr>
+                <w:rFonts w:ascii="Calibri" w:cs="Calibri" w:eastAsia="Calibri" w:hAnsi="Calibri"/>
+                <w:b/>
+                <w:bCs/>
+                <w:color w:val="1B1B1E"/>
+                <w:sz w:val="20"/>
+                <w:szCs w:val="20"/>
+              </w:rPr>
+              <w:t xml:space="preserve">Finished on</w:t>
+            </w:r>
+          </w:p>
+          <w:p>
+            <w:pPr>
+              <w:spacing w:after="120" w:before="0"/>
+            </w:pPr>
+            <w:r>
+              <w:rPr>
+                <w:rFonts w:ascii="Calibri" w:cs="Calibri" w:eastAsia="Calibri" w:hAnsi="Calibri"/>
+                <w:color w:val="D1D5DB"/>
+                <w:sz w:val="22"/>
+                <w:szCs w:val="22"/>
+              </w:rPr>
+              <w:t xml:space="preserve">______________________</w:t>
+            </w:r>
+          </w:p>
+        </w:tc>
+      </w:tr>
+    </w:tbl>
+    <w:p>
       <w:r>
         <w:br w:type="page"/>
       </w:r>
@@ -13908,6 +14238,171 @@
       </w:r>
     </w:p>
     <w:p>
+      <w:pPr>
+        <w:spacing w:after="360"/>
+      </w:pPr>
+      <w:r>
+        <w:rPr>
+          <w:rFonts w:ascii="Calibri" w:cs="Calibri" w:eastAsia="Calibri" w:hAnsi="Calibri"/>
+          <w:color w:val="1B1B1E"/>
+          <w:sz w:val="22"/>
+          <w:szCs w:val="22"/>
+        </w:rPr>
+        <w:t xml:space="preserve"> </w:t>
+      </w:r>
+    </w:p>
+    <w:p>
+      <w:pPr>
+        <w:spacing w:after="60" w:before="120"/>
+      </w:pPr>
+      <w:r>
+        <w:rPr>
+          <w:rFonts w:ascii="Calibri" w:cs="Calibri" w:eastAsia="Calibri" w:hAnsi="Calibri"/>
+          <w:b/>
+          <w:bCs/>
+          <w:color w:val="155E75"/>
+          <w:spacing w:val="30"/>
+          <w:sz w:val="17"/>
+          <w:szCs w:val="17"/>
+        </w:rPr>
+        <w:t xml:space="preserve">WHAT YOU WILL HAVE AT THE END</w:t>
+      </w:r>
+    </w:p>
+    <w:p>
+      <w:pPr>
+        <w:spacing w:after="320" w:before="0"/>
+      </w:pPr>
+      <w:r>
+        <w:rPr>
+          <w:rFonts w:ascii="Calibri" w:cs="Calibri" w:eastAsia="Calibri" w:hAnsi="Calibri"/>
+          <w:color w:val="1B1B1E"/>
+          <w:sz w:val="22"/>
+          <w:szCs w:val="22"/>
+        </w:rPr>
+        <w:t xml:space="preserve">Three names, three messages sent, and at least one conversation with somebody who already holds the title.</w:t>
+      </w:r>
+    </w:p>
+    <w:tbl>
+      <w:tblPr>
+        <w:tblW w:type="dxa" w:w="9360"/>
+        <w:tblBorders>
+          <w:top w:val="single" w:color="auto" w:sz="4"/>
+          <w:left w:val="single" w:color="auto" w:sz="4"/>
+          <w:bottom w:val="single" w:color="auto" w:sz="4"/>
+          <w:right w:val="single" w:color="auto" w:sz="4"/>
+          <w:insideH w:val="single" w:color="auto" w:sz="4"/>
+          <w:insideV w:val="single" w:color="auto" w:sz="4"/>
+        </w:tblBorders>
+      </w:tblPr>
+      <w:tblGrid>
+        <w:gridCol w:w="4680"/>
+        <w:gridCol w:w="4680"/>
+      </w:tblGrid>
+      <w:tr>
+        <w:trPr>
+          <w:trHeight w:val="520" w:hRule="atLeast"/>
+        </w:trPr>
+        <w:tc>
+          <w:tcPr>
+            <w:tcW w:type="dxa" w:w="4680"/>
+            <w:tcBorders>
+              <w:top w:val="none"/>
+              <w:left w:val="none"/>
+              <w:bottom w:val="none"/>
+              <w:right w:val="none"/>
+            </w:tcBorders>
+            <w:shd w:fill="FFFFFF" w:color="auto" w:val="clear"/>
+            <w:tcMar>
+              <w:top w:type="dxa" w:w="140"/>
+              <w:left w:type="dxa" w:w="200"/>
+              <w:bottom w:type="dxa" w:w="140"/>
+              <w:right w:type="dxa" w:w="200"/>
+            </w:tcMar>
+            <w:vAlign w:val="center"/>
+          </w:tcPr>
+          <w:p>
+            <w:pPr>
+              <w:spacing w:after="60" w:before="0"/>
+            </w:pPr>
+            <w:r>
+              <w:rPr>
+                <w:rFonts w:ascii="Calibri" w:cs="Calibri" w:eastAsia="Calibri" w:hAnsi="Calibri"/>
+                <w:b/>
+                <w:bCs/>
+                <w:color w:val="1B1B1E"/>
+                <w:sz w:val="20"/>
+                <w:szCs w:val="20"/>
+              </w:rPr>
+              <w:t xml:space="preserve">Started this module on</w:t>
+            </w:r>
+          </w:p>
+          <w:p>
+            <w:pPr>
+              <w:spacing w:after="120" w:before="0"/>
+            </w:pPr>
+            <w:r>
+              <w:rPr>
+                <w:rFonts w:ascii="Calibri" w:cs="Calibri" w:eastAsia="Calibri" w:hAnsi="Calibri"/>
+                <w:color w:val="D1D5DB"/>
+                <w:sz w:val="22"/>
+                <w:szCs w:val="22"/>
+              </w:rPr>
+              <w:t xml:space="preserve">______________________</w:t>
+            </w:r>
+          </w:p>
+        </w:tc>
+        <w:tc>
+          <w:tcPr>
+            <w:tcW w:type="dxa" w:w="4680"/>
+            <w:tcBorders>
+              <w:top w:val="none"/>
+              <w:left w:val="none"/>
+              <w:bottom w:val="none"/>
+              <w:right w:val="none"/>
+            </w:tcBorders>
+            <w:shd w:fill="FFFFFF" w:color="auto" w:val="clear"/>
+            <w:tcMar>
+              <w:top w:type="dxa" w:w="140"/>
+              <w:left w:type="dxa" w:w="200"/>
+              <w:bottom w:type="dxa" w:w="140"/>
+              <w:right w:type="dxa" w:w="200"/>
+            </w:tcMar>
+            <w:vAlign w:val="center"/>
+          </w:tcPr>
+          <w:p>
+            <w:pPr>
+              <w:spacing w:after="60" w:before="0"/>
+            </w:pPr>
+            <w:r>
+              <w:rPr>
+                <w:rFonts w:ascii="Calibri" w:cs="Calibri" w:eastAsia="Calibri" w:hAnsi="Calibri"/>
+                <w:b/>
+                <w:bCs/>
+                <w:color w:val="1B1B1E"/>
+                <w:sz w:val="20"/>
+                <w:szCs w:val="20"/>
+              </w:rPr>
+              <w:t xml:space="preserve">Finished on</w:t>
+            </w:r>
+          </w:p>
+          <w:p>
+            <w:pPr>
+              <w:spacing w:after="120" w:before="0"/>
+            </w:pPr>
+            <w:r>
+              <w:rPr>
+                <w:rFonts w:ascii="Calibri" w:cs="Calibri" w:eastAsia="Calibri" w:hAnsi="Calibri"/>
+                <w:color w:val="D1D5DB"/>
+                <w:sz w:val="22"/>
+                <w:szCs w:val="22"/>
+              </w:rPr>
+              <w:t xml:space="preserve">______________________</w:t>
+            </w:r>
+          </w:p>
+        </w:tc>
+      </w:tr>
+    </w:tbl>
+    <w:p>
       <w:r>
         <w:br w:type="page"/>
       </w:r>
@@ -17134,6 +17629,171 @@
       </w:r>
     </w:p>
     <w:p>
+      <w:pPr>
+        <w:spacing w:after="360"/>
+      </w:pPr>
+      <w:r>
+        <w:rPr>
+          <w:rFonts w:ascii="Calibri" w:cs="Calibri" w:eastAsia="Calibri" w:hAnsi="Calibri"/>
+          <w:color w:val="1B1B1E"/>
+          <w:sz w:val="22"/>
+          <w:szCs w:val="22"/>
+        </w:rPr>
+        <w:t xml:space="preserve"> </w:t>
+      </w:r>
+    </w:p>
+    <w:p>
+      <w:pPr>
+        <w:spacing w:after="60" w:before="120"/>
+      </w:pPr>
+      <w:r>
+        <w:rPr>
+          <w:rFonts w:ascii="Calibri" w:cs="Calibri" w:eastAsia="Calibri" w:hAnsi="Calibri"/>
+          <w:b/>
+          <w:bCs/>
+          <w:color w:val="5B21B6"/>
+          <w:spacing w:val="30"/>
+          <w:sz w:val="17"/>
+          <w:szCs w:val="17"/>
+        </w:rPr>
+        <w:t xml:space="preserve">WHAT YOU WILL HAVE AT THE END</w:t>
+      </w:r>
+    </w:p>
+    <w:p>
+      <w:pPr>
+        <w:spacing w:after="320" w:before="0"/>
+      </w:pPr>
+      <w:r>
+        <w:rPr>
+          <w:rFonts w:ascii="Calibri" w:cs="Calibri" w:eastAsia="Calibri" w:hAnsi="Calibri"/>
+          <w:color w:val="1B1B1E"/>
+          <w:sz w:val="22"/>
+          <w:szCs w:val="22"/>
+        </w:rPr>
+        <w:t xml:space="preserve">A résumé a hiring manager can read in seven seconds, and one application sent properly.</w:t>
+      </w:r>
+    </w:p>
+    <w:tbl>
+      <w:tblPr>
+        <w:tblW w:type="dxa" w:w="9360"/>
+        <w:tblBorders>
+          <w:top w:val="single" w:color="auto" w:sz="4"/>
+          <w:left w:val="single" w:color="auto" w:sz="4"/>
+          <w:bottom w:val="single" w:color="auto" w:sz="4"/>
+          <w:right w:val="single" w:color="auto" w:sz="4"/>
+          <w:insideH w:val="single" w:color="auto" w:sz="4"/>
+          <w:insideV w:val="single" w:color="auto" w:sz="4"/>
+        </w:tblBorders>
+      </w:tblPr>
+      <w:tblGrid>
+        <w:gridCol w:w="4680"/>
+        <w:gridCol w:w="4680"/>
+      </w:tblGrid>
+      <w:tr>
+        <w:trPr>
+          <w:trHeight w:val="520" w:hRule="atLeast"/>
+        </w:trPr>
+        <w:tc>
+          <w:tcPr>
+            <w:tcW w:type="dxa" w:w="4680"/>
+            <w:tcBorders>
+              <w:top w:val="none"/>
+              <w:left w:val="none"/>
+              <w:bottom w:val="none"/>
+              <w:right w:val="none"/>
+            </w:tcBorders>
+            <w:shd w:fill="FFFFFF" w:color="auto" w:val="clear"/>
+            <w:tcMar>
+              <w:top w:type="dxa" w:w="140"/>
+              <w:left w:type="dxa" w:w="200"/>
+              <w:bottom w:type="dxa" w:w="140"/>
+              <w:right w:type="dxa" w:w="200"/>
+            </w:tcMar>
+            <w:vAlign w:val="center"/>
+          </w:tcPr>
+          <w:p>
+            <w:pPr>
+              <w:spacing w:after="60" w:before="0"/>
+            </w:pPr>
+            <w:r>
+              <w:rPr>
+                <w:rFonts w:ascii="Calibri" w:cs="Calibri" w:eastAsia="Calibri" w:hAnsi="Calibri"/>
+                <w:b/>
+                <w:bCs/>
+                <w:color w:val="1B1B1E"/>
+                <w:sz w:val="20"/>
+                <w:szCs w:val="20"/>
+              </w:rPr>
+              <w:t xml:space="preserve">Started this module on</w:t>
+            </w:r>
+          </w:p>
+          <w:p>
+            <w:pPr>
+              <w:spacing w:after="120" w:before="0"/>
+            </w:pPr>
+            <w:r>
+              <w:rPr>
+                <w:rFonts w:ascii="Calibri" w:cs="Calibri" w:eastAsia="Calibri" w:hAnsi="Calibri"/>
+                <w:color w:val="D1D5DB"/>
+                <w:sz w:val="22"/>
+                <w:szCs w:val="22"/>
+              </w:rPr>
+              <w:t xml:space="preserve">______________________</w:t>
+            </w:r>
+          </w:p>
+        </w:tc>
+        <w:tc>
+          <w:tcPr>
+            <w:tcW w:type="dxa" w:w="4680"/>
+            <w:tcBorders>
+              <w:top w:val="none"/>
+              <w:left w:val="none"/>
+              <w:bottom w:val="none"/>
+              <w:right w:val="none"/>
+            </w:tcBorders>
+            <w:shd w:fill="FFFFFF" w:color="auto" w:val="clear"/>
+            <w:tcMar>
+              <w:top w:type="dxa" w:w="140"/>
+              <w:left w:type="dxa" w:w="200"/>
+              <w:bottom w:type="dxa" w:w="140"/>
+              <w:right w:type="dxa" w:w="200"/>
+            </w:tcMar>
+            <w:vAlign w:val="center"/>
+          </w:tcPr>
+          <w:p>
+            <w:pPr>
+              <w:spacing w:after="60" w:before="0"/>
+            </w:pPr>
+            <w:r>
+              <w:rPr>
+                <w:rFonts w:ascii="Calibri" w:cs="Calibri" w:eastAsia="Calibri" w:hAnsi="Calibri"/>
+                <w:b/>
+                <w:bCs/>
+                <w:color w:val="1B1B1E"/>
+                <w:sz w:val="20"/>
+                <w:szCs w:val="20"/>
+              </w:rPr>
+              <w:t xml:space="preserve">Finished on</w:t>
+            </w:r>
+          </w:p>
+          <w:p>
+            <w:pPr>
+              <w:spacing w:after="120" w:before="0"/>
+            </w:pPr>
+            <w:r>
+              <w:rPr>
+                <w:rFonts w:ascii="Calibri" w:cs="Calibri" w:eastAsia="Calibri" w:hAnsi="Calibri"/>
+                <w:color w:val="D1D5DB"/>
+                <w:sz w:val="22"/>
+                <w:szCs w:val="22"/>
+              </w:rPr>
+              <w:t xml:space="preserve">______________________</w:t>
+            </w:r>
+          </w:p>
+        </w:tc>
+      </w:tr>
+    </w:tbl>
+    <w:p>
       <w:r>
         <w:br w:type="page"/>
       </w:r>
@@ -18670,6 +19330,171 @@
       </w:r>
     </w:p>
     <w:p>
+      <w:pPr>
+        <w:spacing w:after="360"/>
+      </w:pPr>
+      <w:r>
+        <w:rPr>
+          <w:rFonts w:ascii="Calibri" w:cs="Calibri" w:eastAsia="Calibri" w:hAnsi="Calibri"/>
+          <w:color w:val="1B1B1E"/>
+          <w:sz w:val="22"/>
+          <w:szCs w:val="22"/>
+        </w:rPr>
+        <w:t xml:space="preserve"> </w:t>
+      </w:r>
+    </w:p>
+    <w:p>
+      <w:pPr>
+        <w:spacing w:after="60" w:before="120"/>
+      </w:pPr>
+      <w:r>
+        <w:rPr>
+          <w:rFonts w:ascii="Calibri" w:cs="Calibri" w:eastAsia="Calibri" w:hAnsi="Calibri"/>
+          <w:b/>
+          <w:bCs/>
+          <w:color w:val="92400E"/>
+          <w:spacing w:val="30"/>
+          <w:sz w:val="17"/>
+          <w:szCs w:val="17"/>
+        </w:rPr>
+        <w:t xml:space="preserve">WHAT YOU WILL HAVE AT THE END</w:t>
+      </w:r>
+    </w:p>
+    <w:p>
+      <w:pPr>
+        <w:spacing w:after="320" w:before="0"/>
+      </w:pPr>
+      <w:r>
+        <w:rPr>
+          <w:rFonts w:ascii="Calibri" w:cs="Calibri" w:eastAsia="Calibri" w:hAnsi="Calibri"/>
+          <w:color w:val="1B1B1E"/>
+          <w:sz w:val="22"/>
+          <w:szCs w:val="22"/>
+        </w:rPr>
+        <w:t xml:space="preserve">One thing you made that a stranger can look at, and three numbers you have actually worked out.</w:t>
+      </w:r>
+    </w:p>
+    <w:tbl>
+      <w:tblPr>
+        <w:tblW w:type="dxa" w:w="9360"/>
+        <w:tblBorders>
+          <w:top w:val="single" w:color="auto" w:sz="4"/>
+          <w:left w:val="single" w:color="auto" w:sz="4"/>
+          <w:bottom w:val="single" w:color="auto" w:sz="4"/>
+          <w:right w:val="single" w:color="auto" w:sz="4"/>
+          <w:insideH w:val="single" w:color="auto" w:sz="4"/>
+          <w:insideV w:val="single" w:color="auto" w:sz="4"/>
+        </w:tblBorders>
+      </w:tblPr>
+      <w:tblGrid>
+        <w:gridCol w:w="4680"/>
+        <w:gridCol w:w="4680"/>
+      </w:tblGrid>
+      <w:tr>
+        <w:trPr>
+          <w:trHeight w:val="520" w:hRule="atLeast"/>
+        </w:trPr>
+        <w:tc>
+          <w:tcPr>
+            <w:tcW w:type="dxa" w:w="4680"/>
+            <w:tcBorders>
+              <w:top w:val="none"/>
+              <w:left w:val="none"/>
+              <w:bottom w:val="none"/>
+              <w:right w:val="none"/>
+            </w:tcBorders>
+            <w:shd w:fill="FFFFFF" w:color="auto" w:val="clear"/>
+            <w:tcMar>
+              <w:top w:type="dxa" w:w="140"/>
+              <w:left w:type="dxa" w:w="200"/>
+              <w:bottom w:type="dxa" w:w="140"/>
+              <w:right w:type="dxa" w:w="200"/>
+            </w:tcMar>
+            <w:vAlign w:val="center"/>
+          </w:tcPr>
+          <w:p>
+            <w:pPr>
+              <w:spacing w:after="60" w:before="0"/>
+            </w:pPr>
+            <w:r>
+              <w:rPr>
+                <w:rFonts w:ascii="Calibri" w:cs="Calibri" w:eastAsia="Calibri" w:hAnsi="Calibri"/>
+                <w:b/>
+                <w:bCs/>
+                <w:color w:val="1B1B1E"/>
+                <w:sz w:val="20"/>
+                <w:szCs w:val="20"/>
+              </w:rPr>
+              <w:t xml:space="preserve">Started this module on</w:t>
+            </w:r>
+          </w:p>
+          <w:p>
+            <w:pPr>
+              <w:spacing w:after="120" w:before="0"/>
+            </w:pPr>
+            <w:r>
+              <w:rPr>
+                <w:rFonts w:ascii="Calibri" w:cs="Calibri" w:eastAsia="Calibri" w:hAnsi="Calibri"/>
+                <w:color w:val="D1D5DB"/>
+                <w:sz w:val="22"/>
+                <w:szCs w:val="22"/>
+              </w:rPr>
+              <w:t xml:space="preserve">______________________</w:t>
+            </w:r>
+          </w:p>
+        </w:tc>
+        <w:tc>
+          <w:tcPr>
+            <w:tcW w:type="dxa" w:w="4680"/>
+            <w:tcBorders>
+              <w:top w:val="none"/>
+              <w:left w:val="none"/>
+              <w:bottom w:val="none"/>
+              <w:right w:val="none"/>
+            </w:tcBorders>
+            <w:shd w:fill="FFFFFF" w:color="auto" w:val="clear"/>
+            <w:tcMar>
+              <w:top w:type="dxa" w:w="140"/>
+              <w:left w:type="dxa" w:w="200"/>
+              <w:bottom w:type="dxa" w:w="140"/>
+              <w:right w:type="dxa" w:w="200"/>
+            </w:tcMar>
+            <w:vAlign w:val="center"/>
+          </w:tcPr>
+          <w:p>
+            <w:pPr>
+              <w:spacing w:after="60" w:before="0"/>
+            </w:pPr>
+            <w:r>
+              <w:rPr>
+                <w:rFonts w:ascii="Calibri" w:cs="Calibri" w:eastAsia="Calibri" w:hAnsi="Calibri"/>
+                <w:b/>
+                <w:bCs/>
+                <w:color w:val="1B1B1E"/>
+                <w:sz w:val="20"/>
+                <w:szCs w:val="20"/>
+              </w:rPr>
+              <w:t xml:space="preserve">Finished on</w:t>
+            </w:r>
+          </w:p>
+          <w:p>
+            <w:pPr>
+              <w:spacing w:after="120" w:before="0"/>
+            </w:pPr>
+            <w:r>
+              <w:rPr>
+                <w:rFonts w:ascii="Calibri" w:cs="Calibri" w:eastAsia="Calibri" w:hAnsi="Calibri"/>
+                <w:color w:val="D1D5DB"/>
+                <w:sz w:val="22"/>
+                <w:szCs w:val="22"/>
+              </w:rPr>
+              <w:t xml:space="preserve">______________________</w:t>
+            </w:r>
+          </w:p>
+        </w:tc>
+      </w:tr>
+    </w:tbl>
+    <w:p>
       <w:r>
         <w:br w:type="page"/>
       </w:r>
@@ -20622,6 +21447,171 @@
       </w:r>
     </w:p>
     <w:p>
+      <w:pPr>
+        <w:spacing w:after="360"/>
+      </w:pPr>
+      <w:r>
+        <w:rPr>
+          <w:rFonts w:ascii="Calibri" w:cs="Calibri" w:eastAsia="Calibri" w:hAnsi="Calibri"/>
+          <w:color w:val="1B1B1E"/>
+          <w:sz w:val="22"/>
+          <w:szCs w:val="22"/>
+        </w:rPr>
+        <w:t xml:space="preserve"> </w:t>
+      </w:r>
+    </w:p>
+    <w:p>
+      <w:pPr>
+        <w:spacing w:after="60" w:before="120"/>
+      </w:pPr>
+      <w:r>
+        <w:rPr>
+          <w:rFonts w:ascii="Calibri" w:cs="Calibri" w:eastAsia="Calibri" w:hAnsi="Calibri"/>
+          <w:b/>
+          <w:bCs/>
+          <w:color w:val="065F46"/>
+          <w:spacing w:val="30"/>
+          <w:sz w:val="17"/>
+          <w:szCs w:val="17"/>
+        </w:rPr>
+        <w:t xml:space="preserve">WHAT YOU WILL HAVE AT THE END</w:t>
+      </w:r>
+    </w:p>
+    <w:p>
+      <w:pPr>
+        <w:spacing w:after="320" w:before="0"/>
+      </w:pPr>
+      <w:r>
+        <w:rPr>
+          <w:rFonts w:ascii="Calibri" w:cs="Calibri" w:eastAsia="Calibri" w:hAnsi="Calibri"/>
+          <w:color w:val="1B1B1E"/>
+          <w:sz w:val="22"/>
+          <w:szCs w:val="22"/>
+        </w:rPr>
+        <w:t xml:space="preserve">A bridge statement you can say without flinching, and a number you decided before anyone asked.</w:t>
+      </w:r>
+    </w:p>
+    <w:tbl>
+      <w:tblPr>
+        <w:tblW w:type="dxa" w:w="9360"/>
+        <w:tblBorders>
+          <w:top w:val="single" w:color="auto" w:sz="4"/>
+          <w:left w:val="single" w:color="auto" w:sz="4"/>
+          <w:bottom w:val="single" w:color="auto" w:sz="4"/>
+          <w:right w:val="single" w:color="auto" w:sz="4"/>
+          <w:insideH w:val="single" w:color="auto" w:sz="4"/>
+          <w:insideV w:val="single" w:color="auto" w:sz="4"/>
+        </w:tblBorders>
+      </w:tblPr>
+      <w:tblGrid>
+        <w:gridCol w:w="4680"/>
+        <w:gridCol w:w="4680"/>
+      </w:tblGrid>
+      <w:tr>
+        <w:trPr>
+          <w:trHeight w:val="520" w:hRule="atLeast"/>
+        </w:trPr>
+        <w:tc>
+          <w:tcPr>
+            <w:tcW w:type="dxa" w:w="4680"/>
+            <w:tcBorders>
+              <w:top w:val="none"/>
+              <w:left w:val="none"/>
+              <w:bottom w:val="none"/>
+              <w:right w:val="none"/>
+            </w:tcBorders>
+            <w:shd w:fill="FFFFFF" w:color="auto" w:val="clear"/>
+            <w:tcMar>
+              <w:top w:type="dxa" w:w="140"/>
+              <w:left w:type="dxa" w:w="200"/>
+              <w:bottom w:type="dxa" w:w="140"/>
+              <w:right w:type="dxa" w:w="200"/>
+            </w:tcMar>
+            <w:vAlign w:val="center"/>
+          </w:tcPr>
+          <w:p>
+            <w:pPr>
+              <w:spacing w:after="60" w:before="0"/>
+            </w:pPr>
+            <w:r>
+              <w:rPr>
+                <w:rFonts w:ascii="Calibri" w:cs="Calibri" w:eastAsia="Calibri" w:hAnsi="Calibri"/>
+                <w:b/>
+                <w:bCs/>
+                <w:color w:val="1B1B1E"/>
+                <w:sz w:val="20"/>
+                <w:szCs w:val="20"/>
+              </w:rPr>
+              <w:t xml:space="preserve">Started this module on</w:t>
+            </w:r>
+          </w:p>
+          <w:p>
+            <w:pPr>
+              <w:spacing w:after="120" w:before="0"/>
+            </w:pPr>
+            <w:r>
+              <w:rPr>
+                <w:rFonts w:ascii="Calibri" w:cs="Calibri" w:eastAsia="Calibri" w:hAnsi="Calibri"/>
+                <w:color w:val="D1D5DB"/>
+                <w:sz w:val="22"/>
+                <w:szCs w:val="22"/>
+              </w:rPr>
+              <w:t xml:space="preserve">______________________</w:t>
+            </w:r>
+          </w:p>
+        </w:tc>
+        <w:tc>
+          <w:tcPr>
+            <w:tcW w:type="dxa" w:w="4680"/>
+            <w:tcBorders>
+              <w:top w:val="none"/>
+              <w:left w:val="none"/>
+              <w:bottom w:val="none"/>
+              <w:right w:val="none"/>
+            </w:tcBorders>
+            <w:shd w:fill="FFFFFF" w:color="auto" w:val="clear"/>
+            <w:tcMar>
+              <w:top w:type="dxa" w:w="140"/>
+              <w:left w:type="dxa" w:w="200"/>
+              <w:bottom w:type="dxa" w:w="140"/>
+              <w:right w:type="dxa" w:w="200"/>
+            </w:tcMar>
+            <w:vAlign w:val="center"/>
+          </w:tcPr>
+          <w:p>
+            <w:pPr>
+              <w:spacing w:after="60" w:before="0"/>
+            </w:pPr>
+            <w:r>
+              <w:rPr>
+                <w:rFonts w:ascii="Calibri" w:cs="Calibri" w:eastAsia="Calibri" w:hAnsi="Calibri"/>
+                <w:b/>
+                <w:bCs/>
+                <w:color w:val="1B1B1E"/>
+                <w:sz w:val="20"/>
+                <w:szCs w:val="20"/>
+              </w:rPr>
+              <w:t xml:space="preserve">Finished on</w:t>
+            </w:r>
+          </w:p>
+          <w:p>
+            <w:pPr>
+              <w:spacing w:after="120" w:before="0"/>
+            </w:pPr>
+            <w:r>
+              <w:rPr>
+                <w:rFonts w:ascii="Calibri" w:cs="Calibri" w:eastAsia="Calibri" w:hAnsi="Calibri"/>
+                <w:color w:val="D1D5DB"/>
+                <w:sz w:val="22"/>
+                <w:szCs w:val="22"/>
+              </w:rPr>
+              <w:t xml:space="preserve">______________________</w:t>
+            </w:r>
+          </w:p>
+        </w:tc>
+      </w:tr>
+    </w:tbl>
+    <w:p>
       <w:r>
         <w:br w:type="page"/>
       </w:r>
@@ -22903,6 +23893,171 @@
         <w:t xml:space="preserve">The message you answer</w:t>
       </w:r>
     </w:p>
+    <w:p>
+      <w:pPr>
+        <w:spacing w:after="360"/>
+      </w:pPr>
+      <w:r>
+        <w:rPr>
+          <w:rFonts w:ascii="Calibri" w:cs="Calibri" w:eastAsia="Calibri" w:hAnsi="Calibri"/>
+          <w:color w:val="1B1B1E"/>
+          <w:sz w:val="22"/>
+          <w:szCs w:val="22"/>
+        </w:rPr>
+        <w:t xml:space="preserve"> </w:t>
+      </w:r>
+    </w:p>
+    <w:p>
+      <w:pPr>
+        <w:spacing w:after="60" w:before="120"/>
+      </w:pPr>
+      <w:r>
+        <w:rPr>
+          <w:rFonts w:ascii="Calibri" w:cs="Calibri" w:eastAsia="Calibri" w:hAnsi="Calibri"/>
+          <w:b/>
+          <w:bCs/>
+          <w:color w:val="9D174D"/>
+          <w:spacing w:val="30"/>
+          <w:sz w:val="17"/>
+          <w:szCs w:val="17"/>
+        </w:rPr>
+        <w:t xml:space="preserve">WHAT YOU WILL HAVE AT THE END</w:t>
+      </w:r>
+    </w:p>
+    <w:p>
+      <w:pPr>
+        <w:spacing w:after="320" w:before="0"/>
+      </w:pPr>
+      <w:r>
+        <w:rPr>
+          <w:rFonts w:ascii="Calibri" w:cs="Calibri" w:eastAsia="Calibri" w:hAnsi="Calibri"/>
+          <w:color w:val="1B1B1E"/>
+          <w:sz w:val="22"/>
+          <w:szCs w:val="22"/>
+        </w:rPr>
+        <w:t xml:space="preserve">Your story written down, and one message answered for somebody a year behind you.</w:t>
+      </w:r>
+    </w:p>
+    <w:tbl>
+      <w:tblPr>
+        <w:tblW w:type="dxa" w:w="9360"/>
+        <w:tblBorders>
+          <w:top w:val="single" w:color="auto" w:sz="4"/>
+          <w:left w:val="single" w:color="auto" w:sz="4"/>
+          <w:bottom w:val="single" w:color="auto" w:sz="4"/>
+          <w:right w:val="single" w:color="auto" w:sz="4"/>
+          <w:insideH w:val="single" w:color="auto" w:sz="4"/>
+          <w:insideV w:val="single" w:color="auto" w:sz="4"/>
+        </w:tblBorders>
+      </w:tblPr>
+      <w:tblGrid>
+        <w:gridCol w:w="4680"/>
+        <w:gridCol w:w="4680"/>
+      </w:tblGrid>
+      <w:tr>
+        <w:trPr>
+          <w:trHeight w:val="520" w:hRule="atLeast"/>
+        </w:trPr>
+        <w:tc>
+          <w:tcPr>
+            <w:tcW w:type="dxa" w:w="4680"/>
+            <w:tcBorders>
+              <w:top w:val="none"/>
+              <w:left w:val="none"/>
+              <w:bottom w:val="none"/>
+              <w:right w:val="none"/>
+            </w:tcBorders>
+            <w:shd w:fill="FFFFFF" w:color="auto" w:val="clear"/>
+            <w:tcMar>
+              <w:top w:type="dxa" w:w="140"/>
+              <w:left w:type="dxa" w:w="200"/>
+              <w:bottom w:type="dxa" w:w="140"/>
+              <w:right w:type="dxa" w:w="200"/>
+            </w:tcMar>
+            <w:vAlign w:val="center"/>
+          </w:tcPr>
+          <w:p>
+            <w:pPr>
+              <w:spacing w:after="60" w:before="0"/>
+            </w:pPr>
+            <w:r>
+              <w:rPr>
+                <w:rFonts w:ascii="Calibri" w:cs="Calibri" w:eastAsia="Calibri" w:hAnsi="Calibri"/>
+                <w:b/>
+                <w:bCs/>
+                <w:color w:val="1B1B1E"/>
+                <w:sz w:val="20"/>
+                <w:szCs w:val="20"/>
+              </w:rPr>
+              <w:t xml:space="preserve">Started this module on</w:t>
+            </w:r>
+          </w:p>
+          <w:p>
+            <w:pPr>
+              <w:spacing w:after="120" w:before="0"/>
+            </w:pPr>
+            <w:r>
+              <w:rPr>
+                <w:rFonts w:ascii="Calibri" w:cs="Calibri" w:eastAsia="Calibri" w:hAnsi="Calibri"/>
+                <w:color w:val="D1D5DB"/>
+                <w:sz w:val="22"/>
+                <w:szCs w:val="22"/>
+              </w:rPr>
+              <w:t xml:space="preserve">______________________</w:t>
+            </w:r>
+          </w:p>
+        </w:tc>
+        <w:tc>
+          <w:tcPr>
+            <w:tcW w:type="dxa" w:w="4680"/>
+            <w:tcBorders>
+              <w:top w:val="none"/>
+              <w:left w:val="none"/>
+              <w:bottom w:val="none"/>
+              <w:right w:val="none"/>
+            </w:tcBorders>
+            <w:shd w:fill="FFFFFF" w:color="auto" w:val="clear"/>
+            <w:tcMar>
+              <w:top w:type="dxa" w:w="140"/>
+              <w:left w:type="dxa" w:w="200"/>
+              <w:bottom w:type="dxa" w:w="140"/>
+              <w:right w:type="dxa" w:w="200"/>
+            </w:tcMar>
+            <w:vAlign w:val="center"/>
+          </w:tcPr>
+          <w:p>
+            <w:pPr>
+              <w:spacing w:after="60" w:before="0"/>
+            </w:pPr>
+            <w:r>
+              <w:rPr>
+                <w:rFonts w:ascii="Calibri" w:cs="Calibri" w:eastAsia="Calibri" w:hAnsi="Calibri"/>
+                <w:b/>
+                <w:bCs/>
+                <w:color w:val="1B1B1E"/>
+                <w:sz w:val="20"/>
+                <w:szCs w:val="20"/>
+              </w:rPr>
+              <w:t xml:space="preserve">Finished on</w:t>
+            </w:r>
+          </w:p>
+          <w:p>
+            <w:pPr>
+              <w:spacing w:after="120" w:before="0"/>
+            </w:pPr>
+            <w:r>
+              <w:rPr>
+                <w:rFonts w:ascii="Calibri" w:cs="Calibri" w:eastAsia="Calibri" w:hAnsi="Calibri"/>
+                <w:color w:val="D1D5DB"/>
+                <w:sz w:val="22"/>
+                <w:szCs w:val="22"/>
+              </w:rPr>
+              <w:t xml:space="preserve">______________________</w:t>
+            </w:r>
+          </w:p>
+        </w:tc>
+      </w:tr>
+    </w:tbl>
     <w:p>
       <w:r>
         <w:br w:type="page"/>

</xml_diff>

<commit_message>
Workbook cover says what to do with it
The kicker said companion workbook and the title said 'The workbook.',
which is the same word twice. The subtitle described the document to
itself: 'ninety days of the thinking that does not fit in a text box'.

Cover is now Transition OS, ninety days / Workbook / 'Print it, or type
straight into it. Every lesson that asks you to write something down has
a page in here.' The stat line carries a real number instead of an
estimate of how long writing takes: seven modules, forty-eight lessons.

Same fault on the how-to page: the rule about writing badly ended with
'the box is for thinking, not for prose', which explains the box to you
instead of telling you what to do. Both rules rewritten.
</commit_message>
<xml_diff>
--- a/public/course/transition-os-workbook.docx
+++ b/public/course/transition-os-workbook.docx
@@ -30,7 +30,7 @@
           <w:sz w:val="17"/>
           <w:szCs w:val="17"/>
         </w:rPr>
-        <w:t xml:space="preserve">TRANSITION OS · COMPANION WORKBOOK</w:t>
+        <w:t xml:space="preserve">TRANSITION OS · NINETY DAYS</w:t>
       </w:r>
     </w:p>
     <w:p>
@@ -46,7 +46,7 @@
           <w:sz w:val="66"/>
           <w:szCs w:val="66"/>
         </w:rPr>
-        <w:t xml:space="preserve">The workbook.</w:t>
+        <w:t xml:space="preserve">Workbook</w:t>
       </w:r>
     </w:p>
     <w:p>
@@ -60,7 +60,7 @@
           <w:sz w:val="28"/>
           <w:szCs w:val="28"/>
         </w:rPr>
-        <w:t xml:space="preserve">Ninety days of the thinking that does not fit in a text box. A page for every lesson worth writing by hand.</w:t>
+        <w:t xml:space="preserve">Print it, or type straight into it. Every lesson that asks you to write something down has a page in here.</w:t>
       </w:r>
     </w:p>
     <w:p>
@@ -91,7 +91,7 @@
           <w:sz w:val="22"/>
           <w:szCs w:val="22"/>
         </w:rPr>
-        <w:t xml:space="preserve">Seven modules. About four hours of writing, spread over three months. Nobody reads this but you.</w:t>
+        <w:t xml:space="preserve">Seven modules, forty-eight lessons. Nobody reads this but you.</w:t>
       </w:r>
     </w:p>
     <w:p>
@@ -790,7 +790,7 @@
           <w:sz w:val="22"/>
           <w:szCs w:val="22"/>
         </w:rPr>
-        <w:t xml:space="preserve">Do the lesson on screen first, then the page here. The screen version has the calculators and the animations; this is where you say what you actually think.</w:t>
+        <w:t xml:space="preserve">Do the lesson on screen first, then the page here. The screen does the arithmetic and the sorting. These pages hold the answers only you have.</w:t>
       </w:r>
     </w:p>
     <w:p>
@@ -809,7 +809,7 @@
           <w:sz w:val="22"/>
           <w:szCs w:val="22"/>
         </w:rPr>
-        <w:t xml:space="preserve">Write badly. Fragments, half-sentences, a list. The box is for thinking, not for prose. If you find yourself drafting, you've switched into work mode, and this isn't work.</w:t>
+        <w:t xml:space="preserve">Write badly. Fragments, half-sentences, a list. If you catch yourself drafting sentences, you have switched into work mode, and this is not work.</w:t>
       </w:r>
     </w:p>
     <w:p>

</xml_diff>